<commit_message>
[THESIS] add loi cam doan + regen docx (fix converter: flushright, vspace, quote marks)
</commit_message>
<xml_diff>
--- a/thesis/khoa-luan.docx
+++ b/thesis/khoa-luan.docx
@@ -1715,1720 +1715,86 @@
     </w:p>
     <w:p>
       <w:pPr>
-        <w:pStyle w:val="Normal"/>
-        <w:tabs>
-          <w:tab w:val="clear" w:pos="720"/>
-          <w:tab w:val="left" w:pos="4420" w:leader="none"/>
-        </w:tabs>
+        <w:pStyle w:val="Heading1"/>
         <w:jc w:val="center"/>
-        <w:rPr>
-          <w:rFonts w:ascii="VNI-Times" w:hAnsi="VNI-Times" w:cs="VNI-Times"/>
-          <w:b/>
-          <w:sz w:val="28"/>
-          <w:szCs w:val="28"/>
-          <w:lang w:val="en-US" w:eastAsia="en-US"/>
-        </w:rPr>
-      </w:pPr>
-      <w:r>
-        <w:rPr>
-          <w:rFonts w:cs="VNI-Times" w:ascii="VNI-Times" w:hAnsi="VNI-Times"/>
-          <w:b/>
-          <w:sz w:val="28"/>
-          <w:szCs w:val="28"/>
-          <w:lang w:val="en-US" w:eastAsia="en-US"/>
-        </w:rPr>
-        <mc:AlternateContent>
-          <mc:Choice Requires="wpg">
-            <w:drawing>
-              <wp:anchor behindDoc="1" distT="0" distB="0" distL="114935" distR="114935" simplePos="0" locked="0" layoutInCell="1" allowOverlap="1" relativeHeight="3">
-                <wp:simplePos x="0" y="0"/>
-                <wp:positionH relativeFrom="column">
-                  <wp:posOffset>79375</wp:posOffset>
-                </wp:positionH>
-                <wp:positionV relativeFrom="paragraph">
-                  <wp:posOffset>125095</wp:posOffset>
-                </wp:positionV>
-                <wp:extent cx="5942965" cy="8723630"/>
-                <wp:effectExtent l="26670" t="11430" r="41275" b="38735"/>
-                <wp:wrapNone/>
-                <wp:docPr id="4" name=""/>
-                <a:graphic xmlns:a="http://schemas.openxmlformats.org/drawingml/2006/main">
-                  <a:graphicData uri="http://schemas.microsoft.com/office/word/2010/wordprocessingGroup">
-                    <wpg:wgp>
-                      <wpg:cNvGrpSpPr/>
-                      <wpg:grpSpPr>
-                        <a:xfrm>
-                          <a:off x="0" y="0"/>
-                          <a:ext cx="5942880" cy="8723520"/>
-                          <a:chOff x="0" y="0"/>
-                          <a:chExt cx="5942880" cy="8723520"/>
-                        </a:xfrm>
-                      </wpg:grpSpPr>
-                      <wps:wsp>
-                        <wps:cNvPr id="2" name=""/>
-                        <wps:cNvSpPr/>
-                        <wps:spPr>
-                          <a:xfrm>
-                            <a:off x="11520" y="27360"/>
-                            <a:ext cx="5896440" cy="8659440"/>
-                          </a:xfrm>
-                          <a:prstGeom prst="rect">
-                            <a:avLst/>
-                          </a:prstGeom>
-                          <a:noFill/>
-                          <a:ln w="76320">
-                            <a:solidFill>
-                              <a:srgbClr val="0000ff"/>
-                            </a:solidFill>
-                            <a:miter/>
-                          </a:ln>
-                          <a:effectLst>
-                            <a:outerShdw dist="53966" dir="2700000" blurRad="0" rotWithShape="0">
-                              <a:srgbClr val="c0c0c0"/>
-                            </a:outerShdw>
-                          </a:effectLst>
-                        </wps:spPr>
-                        <wps:style>
-                          <a:lnRef idx="0"/>
-                          <a:fillRef idx="0"/>
-                          <a:effectRef idx="0"/>
-                          <a:fontRef idx="minor"/>
-                        </wps:style>
-                        <wps:bodyPr/>
-                      </wps:wsp>
-                      <pic:pic xmlns:pic="http://schemas.openxmlformats.org/drawingml/2006/picture">
-                        <pic:nvPicPr>
-                          <pic:cNvPr id="5" name="" descr=""/>
-                          <pic:cNvPicPr/>
-                        </pic:nvPicPr>
-                        <pic:blipFill>
-                          <a:blip r:embed="rId2"/>
-                          <a:stretch/>
-                        </pic:blipFill>
-                        <pic:spPr>
-                          <a:xfrm>
-                            <a:off x="4354200" y="7268040"/>
-                            <a:ext cx="1588680" cy="1455480"/>
-                          </a:xfrm>
-                          <a:prstGeom prst="rect">
-                            <a:avLst/>
-                          </a:prstGeom>
-                          <a:ln w="0">
-                            <a:noFill/>
-                          </a:ln>
-                        </pic:spPr>
-                      </pic:pic>
-                      <pic:pic xmlns:pic="http://schemas.openxmlformats.org/drawingml/2006/picture">
-                        <pic:nvPicPr>
-                          <pic:cNvPr id="6" name="" descr=""/>
-                          <pic:cNvPicPr/>
-                        </pic:nvPicPr>
-                        <pic:blipFill>
-                          <a:blip r:embed="rId3"/>
-                          <a:stretch/>
-                        </pic:blipFill>
-                        <pic:spPr>
-                          <a:xfrm>
-                            <a:off x="0" y="0"/>
-                            <a:ext cx="1588680" cy="1455480"/>
-                          </a:xfrm>
-                          <a:prstGeom prst="rect">
-                            <a:avLst/>
-                          </a:prstGeom>
-                          <a:ln w="0">
-                            <a:noFill/>
-                          </a:ln>
-                        </pic:spPr>
-                      </pic:pic>
-                    </wpg:wgp>
-                  </a:graphicData>
-                </a:graphic>
-              </wp:anchor>
-            </w:drawing>
-          </mc:Choice>
-          <mc:Fallback>
-            <w:pict>
-              <v:group id="shape_0" style="position:absolute;margin-left:6.25pt;margin-top:9.85pt;width:467.95pt;height:686.85pt" coordorigin="125,197" coordsize="9359,13737">
-                <v:rect id="shape_0" stroked="t" o:allowincell="f" style="position:absolute;left:143;top:240;width:9285;height:13636;mso-wrap-style:none;v-text-anchor:middle">
-                  <v:fill o:detectmouseclick="t" on="false"/>
-                  <v:stroke color="blue" weight="76320" joinstyle="miter" endcap="flat"/>
-                  <v:shadow on="t" obscured="f" color="silver"/>
-                  <w10:wrap type="none"/>
-                </v:rect>
-                <v:shapetype id="_x0000_t75" coordsize="21600,21600" o:spt="75" o:preferrelative="t" path="m@4@5l@4@11@9@11@9@5xe" filled="f" stroked="f">
-                  <v:stroke joinstyle="miter"/>
-                  <v:formulas>
-                    <v:f eqn="if lineDrawn pixelLineWidth 0"/>
-                    <v:f eqn="sum @0 1 0"/>
-                    <v:f eqn="sum 0 0 @1"/>
-                    <v:f eqn="prod @2 1 2"/>
-                    <v:f eqn="prod @3 21600 pixelWidth"/>
-                    <v:f eqn="prod @3 21600 pixelHeight"/>
-                    <v:f eqn="sum @0 0 1"/>
-                    <v:f eqn="prod @6 1 2"/>
-                    <v:f eqn="prod @7 21600 pixelWidth"/>
-                    <v:f eqn="sum @8 21600 0"/>
-                    <v:f eqn="prod @7 21600 pixelHeight"/>
-                    <v:f eqn="sum @10 21600 0"/>
-                  </v:formulas>
-                  <v:path o:extrusionok="f" gradientshapeok="t" o:connecttype="rect"/>
-                  <o:lock v:ext="edit" aspectratio="t"/>
-                </v:shapetype>
-                <v:shape id="shape_0" stroked="f" o:allowincell="f" style="position:absolute;left:6982;top:11642;width:2501;height:2291;mso-wrap-style:none;v-text-anchor:middle" type="_x0000_t75">
-                  <v:imagedata r:id="rId2" o:detectmouseclick="t"/>
-                  <v:stroke color="#3465a4" joinstyle="round" endcap="flat"/>
-                  <w10:wrap type="none"/>
-                </v:shape>
-                <v:shape id="shape_0" stroked="f" o:allowincell="f" style="position:absolute;left:125;top:197;width:2501;height:2291;mso-wrap-style:none;v-text-anchor:middle" type="_x0000_t75">
-                  <v:imagedata r:id="rId3" o:detectmouseclick="t"/>
-                  <v:stroke color="#3465a4" joinstyle="round" endcap="flat"/>
-                  <w10:wrap type="none"/>
-                </v:shape>
-              </v:group>
-            </w:pict>
-          </mc:Fallback>
-        </mc:AlternateContent>
-      </w:r>
-    </w:p>
-    <w:p>
-      <w:pPr>
-        <w:pStyle w:val="Normal"/>
-        <w:tabs>
-          <w:tab w:val="clear" w:pos="720"/>
-          <w:tab w:val="left" w:pos="4420" w:leader="none"/>
-        </w:tabs>
-        <w:jc w:val="center"/>
-        <w:rPr>
-          <w:rFonts w:ascii="VNI-Times" w:hAnsi="VNI-Times" w:cs="VNI-Times"/>
-          <w:b/>
-          <w:sz w:val="28"/>
-          <w:szCs w:val="28"/>
-        </w:rPr>
-      </w:pPr>
-      <w:r>
-        <w:rPr>
-          <w:rFonts w:cs="VNI-Times" w:ascii="VNI-Times" w:hAnsi="VNI-Times"/>
-          <w:b/>
-          <w:sz w:val="28"/>
-          <w:szCs w:val="28"/>
-        </w:rPr>
-      </w:r>
-    </w:p>
-    <w:p>
-      <w:pPr>
-        <w:pStyle w:val="Normal"/>
-        <w:jc w:val="center"/>
-        <w:rPr>
-          <w:b/>
-          <w:sz w:val="28"/>
-          <w:szCs w:val="28"/>
-        </w:rPr>
-      </w:pPr>
-      <w:r>
-        <w:rPr>
-          <w:b/>
-          <w:sz w:val="28"/>
-          <w:szCs w:val="28"/>
-        </w:rPr>
-        <w:t>ĐẠI HỌC QUỐC GIA THÀNH PHỐ HỒ CHÍ MINH</w:t>
-      </w:r>
-    </w:p>
-    <w:p>
-      <w:pPr>
-        <w:pStyle w:val="Normal"/>
-        <w:jc w:val="center"/>
-        <w:rPr>
-          <w:b/>
-          <w:sz w:val="28"/>
-          <w:szCs w:val="28"/>
-        </w:rPr>
-      </w:pPr>
-      <w:r>
-        <w:rPr>
-          <w:b/>
-          <w:sz w:val="28"/>
-          <w:szCs w:val="28"/>
-        </w:rPr>
-        <w:t>TRƯỜNG ĐẠI HỌC KHOA HỌC TỰ NHIÊN</w:t>
-      </w:r>
-    </w:p>
-    <w:p>
-      <w:pPr>
-        <w:pStyle w:val="Normal"/>
-        <w:jc w:val="center"/>
-        <w:rPr>
-          <w:b/>
-          <w:sz w:val="28"/>
-          <w:szCs w:val="28"/>
-        </w:rPr>
-      </w:pPr>
-      <w:r>
-        <w:rPr>
-          <w:b/>
-          <w:sz w:val="28"/>
-          <w:szCs w:val="28"/>
-        </w:rPr>
-        <w:t>KHOA ĐIỆN TỬ VIỄN THÔNG</w:t>
-      </w:r>
-    </w:p>
-    <w:p>
-      <w:pPr>
-        <w:pStyle w:val="Normal"/>
-        <w:jc w:val="center"/>
-        <w:rPr>
-          <w:b/>
-          <w:sz w:val="28"/>
-          <w:szCs w:val="28"/>
-        </w:rPr>
-      </w:pPr>
-      <w:r>
-        <w:rPr>
-          <w:b/>
-          <w:sz w:val="28"/>
-          <w:szCs w:val="28"/>
-        </w:rPr>
-        <w:t>BỘ MÔN MÁY TÍNH – HỆ THỐNG NHÚNG</w:t>
-      </w:r>
-    </w:p>
-    <w:p>
-      <w:pPr>
-        <w:pStyle w:val="Normal"/>
-        <w:jc w:val="center"/>
-        <w:rPr>
-          <w:sz w:val="28"/>
-          <w:szCs w:val="28"/>
-        </w:rPr>
-      </w:pPr>
-      <w:r>
-        <w:rPr>
-          <w:sz w:val="28"/>
-          <w:szCs w:val="28"/>
-        </w:rPr>
-        <w:drawing>
-          <wp:inline distT="0" distB="0" distL="0" distR="0">
-            <wp:extent cx="1675765" cy="429260"/>
-            <wp:effectExtent l="0" t="0" r="0" b="0"/>
-            <wp:docPr id="5" name="Image1" descr="" title=""/>
-            <wp:cNvGraphicFramePr>
-              <a:graphicFrameLocks xmlns:a="http://schemas.openxmlformats.org/drawingml/2006/main" noChangeAspect="1"/>
-            </wp:cNvGraphicFramePr>
-            <a:graphic xmlns:a="http://schemas.openxmlformats.org/drawingml/2006/main">
-              <a:graphicData uri="http://schemas.openxmlformats.org/drawingml/2006/picture">
-                <pic:pic xmlns:pic="http://schemas.openxmlformats.org/drawingml/2006/picture">
-                  <pic:nvPicPr>
-                    <pic:cNvPr id="7" name="Image1" descr="" title=""/>
-                    <pic:cNvPicPr>
-                      <a:picLocks noChangeAspect="1" noChangeArrowheads="1"/>
-                    </pic:cNvPicPr>
-                  </pic:nvPicPr>
-                  <pic:blipFill>
-                    <a:blip r:embed="rId6"/>
-                    <a:srcRect l="-18" t="-70" r="-18" b="-70"/>
-                    <a:stretch>
-                      <a:fillRect/>
-                    </a:stretch>
-                  </pic:blipFill>
-                  <pic:spPr bwMode="auto">
-                    <a:xfrm>
-                      <a:off x="0" y="0"/>
-                      <a:ext cx="1675765" cy="429260"/>
-                    </a:xfrm>
-                    <a:prstGeom prst="rect">
-                      <a:avLst/>
-                    </a:prstGeom>
-                  </pic:spPr>
-                </pic:pic>
-              </a:graphicData>
-            </a:graphic>
-          </wp:inline>
-        </w:drawing>
-      </w:r>
-    </w:p>
-    <w:p>
-      <w:pPr>
-        <w:pStyle w:val="Normal"/>
-        <w:rPr>
-          <w:sz w:val="28"/>
-          <w:szCs w:val="28"/>
-        </w:rPr>
-      </w:pPr>
-      <w:r>
-        <w:rPr>
-          <w:sz w:val="28"/>
-          <w:szCs w:val="28"/>
-        </w:rPr>
-      </w:r>
-    </w:p>
-    <w:p>
-      <w:pPr>
-        <w:pStyle w:val="Normal"/>
-        <w:jc w:val="center"/>
-        <w:rPr>
-          <w:sz w:val="28"/>
-          <w:szCs w:val="28"/>
-        </w:rPr>
-      </w:pPr>
-      <w:r>
-        <w:rPr>
-          <w:sz w:val="28"/>
-          <w:szCs w:val="28"/>
-        </w:rPr>
-      </w:r>
-    </w:p>
-    <w:p>
-      <w:pPr>
-        <w:pStyle w:val="Normal"/>
-        <w:jc w:val="center"/>
-        <w:rPr>
-          <w:sz w:val="28"/>
-          <w:szCs w:val="28"/>
-        </w:rPr>
-      </w:pPr>
-      <w:r>
-        <w:rPr>
-          <w:sz w:val="28"/>
-          <w:szCs w:val="28"/>
-        </w:rPr>
-      </w:r>
-    </w:p>
-    <w:p>
-      <w:pPr>
-        <w:pStyle w:val="Normal"/>
-        <w:jc w:val="center"/>
-        <w:rPr>
-          <w:b/>
-          <w:sz w:val="26"/>
-          <w:szCs w:val="48"/>
-        </w:rPr>
-      </w:pPr>
-      <w:r>
-        <w:rPr>
-          <w:b/>
-          <w:sz w:val="38"/>
-          <w:szCs w:val="48"/>
-        </w:rPr>
-        <w:t>NGUYỄN VĂN A</w:t>
-      </w:r>
-    </w:p>
-    <w:p>
-      <w:pPr>
-        <w:pStyle w:val="Normal"/>
-        <w:jc w:val="center"/>
-        <w:rPr>
-          <w:b/>
-          <w:sz w:val="48"/>
-          <w:szCs w:val="48"/>
-        </w:rPr>
-      </w:pPr>
-      <w:r>
-        <w:rPr>
-          <w:b/>
-          <w:sz w:val="48"/>
-          <w:szCs w:val="48"/>
-        </w:rPr>
-      </w:r>
-    </w:p>
-    <w:p>
-      <w:pPr>
-        <w:pStyle w:val="Normal"/>
-        <w:jc w:val="center"/>
-        <w:rPr>
-          <w:b/>
-          <w:sz w:val="28"/>
-          <w:szCs w:val="28"/>
-        </w:rPr>
-      </w:pPr>
-      <w:r>
-        <w:rPr>
-          <w:b/>
-          <w:sz w:val="28"/>
-          <w:szCs w:val="28"/>
-        </w:rPr>
-      </w:r>
-    </w:p>
-    <w:p>
-      <w:pPr>
-        <w:pStyle w:val="Normal"/>
-        <w:jc w:val="center"/>
-        <w:rPr>
-          <w:sz w:val="28"/>
-          <w:szCs w:val="28"/>
-        </w:rPr>
-      </w:pPr>
-      <w:r>
-        <w:rPr>
-          <w:sz w:val="28"/>
-          <w:szCs w:val="28"/>
-        </w:rPr>
-      </w:r>
-    </w:p>
-    <w:p>
-      <w:pPr>
-        <w:pStyle w:val="Normal"/>
-        <w:jc w:val="center"/>
-        <w:rPr>
-          <w:sz w:val="28"/>
-          <w:szCs w:val="28"/>
-        </w:rPr>
-      </w:pPr>
-      <w:r>
-        <w:rPr>
-          <w:sz w:val="28"/>
-          <w:szCs w:val="28"/>
-        </w:rPr>
-      </w:r>
-    </w:p>
-    <w:p>
-      <w:pPr>
-        <w:pStyle w:val="Normal"/>
-        <w:rPr>
-          <w:b/>
+      </w:pPr>
+      <w:r>
+        <w:rPr>
+          <w:b/>
+        </w:rPr>
+        <w:t>LỜI CAM ĐOAN</w:t>
+      </w:r>
+    </w:p>
+    <w:p>
+      <w:pPr>
+        <w:spacing w:after="120"/>
+        <w:ind w:firstLine="432"/>
+        <w:jc w:val="both"/>
+      </w:pPr>
+      <w:r>
+        <w:t xml:space="preserve">Tôi xin cam đoan khoá luận tốt nghiệp </w:t>
+      </w:r>
+      <w:r>
+        <w:rPr>
+          <w:b/>
+        </w:rPr>
+        <w:t>“Hệ thống định vị trong nhà theo phòng dựa trên BLE Mesh và ESP32, tích hợp thu thập – xử lý dữ liệu qua ThingsBoard”</w:t>
+      </w:r>
+      <w:r>
+        <w:t xml:space="preserve"> là công trình nghiên cứu của bản thân tôi dưới sự hướng dẫn của TS. Huỳnh Hữu Thuận.</w:t>
+      </w:r>
+    </w:p>
+    <w:p>
+      <w:pPr>
+        <w:spacing w:after="120"/>
+        <w:ind w:firstLine="432"/>
+        <w:jc w:val="both"/>
+      </w:pPr>
+      <w:r>
+        <w:t>Các số liệu, kết quả thực nghiệm nêu trong khoá luận là trung thực, do chính tôi thực hiện và chưa từng được công bố trong bất kỳ công trình nào khác. Các nguồn tài liệu được sử dụng đều được trích dẫn đầy đủ, rõ ràng trong phần Tài liệu tham khảo.</w:t>
+      </w:r>
+    </w:p>
+    <w:p>
+      <w:pPr>
+        <w:spacing w:after="120"/>
+        <w:ind w:firstLine="432"/>
+        <w:jc w:val="both"/>
+      </w:pPr>
+      <w:r>
+        <w:t>Tôi hoàn toàn chịu trách nhiệm trước Nhà trường và Khoa Điện tử – Viễn thông về lời cam đoan này.</w:t>
+      </w:r>
+    </w:p>
+    <w:p>
+      <w:pPr>
+        <w:jc w:val="right"/>
+      </w:pPr>
+      <w:r>
+        <w:t>TP. Hồ Chí Minh, tháng 07 năm 2026</w:t>
+      </w:r>
+    </w:p>
+    <w:p>
+      <w:pPr>
+        <w:jc w:val="right"/>
+      </w:pPr>
+      <w:r>
+        <w:rPr>
           <w:i/>
-          <w:i/>
-          <w:sz w:val="32"/>
-          <w:szCs w:val="32"/>
-          <w:u w:val="single"/>
-        </w:rPr>
-      </w:pPr>
-      <w:r>
-        <w:rPr>
-          <w:sz w:val="34"/>
-          <w:szCs w:val="32"/>
-        </w:rPr>
-        <w:t xml:space="preserve"> </w:t>
-      </w:r>
-      <w:r>
-        <w:rPr>
-          <w:sz w:val="34"/>
-          <w:szCs w:val="32"/>
-        </w:rPr>
-        <w:tab/>
-      </w:r>
-      <w:r>
-        <w:rPr>
-          <w:b/>
-          <w:i/>
-          <w:sz w:val="34"/>
-          <w:szCs w:val="32"/>
-          <w:u w:val="single"/>
-        </w:rPr>
-        <w:t>Đề tài khóa luận tốt nghiệp:</w:t>
-      </w:r>
-    </w:p>
-    <w:p>
-      <w:pPr>
-        <w:pStyle w:val="Normal"/>
-        <w:ind w:start="-900" w:end="0"/>
-        <w:jc w:val="center"/>
-        <w:rPr>
-          <w:b/>
-          <w:i/>
-          <w:i/>
-          <w:color w:val="993366"/>
-          <w:sz w:val="36"/>
-          <w:szCs w:val="32"/>
-          <w:u w:val="single"/>
-        </w:rPr>
-      </w:pPr>
-      <w:r>
-        <w:rPr>
-          <w:b/>
-          <w:i/>
-          <w:color w:val="993366"/>
-          <w:sz w:val="36"/>
-          <w:szCs w:val="32"/>
-          <w:u w:val="single"/>
-        </w:rPr>
-      </w:r>
-    </w:p>
-    <w:p>
-      <w:pPr>
-        <w:pStyle w:val="Normal"/>
-        <w:jc w:val="center"/>
-        <w:rPr>
-          <w:b/>
-          <w:color w:val="CC0000"/>
-          <w:sz w:val="36"/>
-          <w:szCs w:val="44"/>
-        </w:rPr>
-      </w:pPr>
-      <w:r>
-        <w:rPr>
-          <w:b/>
-          <w:color w:val="CC0000"/>
-          <w:sz w:val="36"/>
-          <w:szCs w:val="44"/>
-        </w:rPr>
-        <w:t>QUY TRÌNH THIẾT KẾ VI MẠCH TÍCH HỢP</w:t>
-      </w:r>
-    </w:p>
-    <w:p>
-      <w:pPr>
-        <w:pStyle w:val="Normal"/>
-        <w:jc w:val="center"/>
-        <w:rPr>
-          <w:b/>
-          <w:bCs/>
-          <w:sz w:val="52"/>
-          <w:szCs w:val="52"/>
-        </w:rPr>
-      </w:pPr>
-      <w:r>
-        <w:rPr>
-          <w:b/>
-          <w:color w:val="CC0000"/>
-          <w:sz w:val="36"/>
-          <w:szCs w:val="44"/>
-        </w:rPr>
-        <w:t>DÙNG KỸ THUẬT DESIGN FOR TEST</w:t>
-      </w:r>
-    </w:p>
-    <w:p>
-      <w:pPr>
-        <w:pStyle w:val="Normal"/>
-        <w:jc w:val="center"/>
-        <w:rPr>
-          <w:b/>
-          <w:bCs/>
-          <w:sz w:val="28"/>
-          <w:szCs w:val="28"/>
-        </w:rPr>
-      </w:pPr>
-      <w:r>
-        <w:rPr>
-          <w:b/>
-          <w:bCs/>
-          <w:sz w:val="28"/>
-          <w:szCs w:val="28"/>
-        </w:rPr>
-      </w:r>
-    </w:p>
-    <w:p>
-      <w:pPr>
-        <w:pStyle w:val="Normal"/>
-        <w:jc w:val="center"/>
-        <w:rPr>
-          <w:sz w:val="28"/>
-          <w:szCs w:val="28"/>
-        </w:rPr>
-      </w:pPr>
-      <w:r>
-        <w:rPr>
-          <w:sz w:val="28"/>
-          <w:szCs w:val="28"/>
-        </w:rPr>
-      </w:r>
-    </w:p>
-    <w:p>
-      <w:pPr>
-        <w:pStyle w:val="Normal"/>
-        <w:jc w:val="center"/>
-        <w:rPr>
-          <w:sz w:val="28"/>
-          <w:szCs w:val="28"/>
-        </w:rPr>
-      </w:pPr>
-      <w:r>
-        <w:rPr>
-          <w:sz w:val="28"/>
-          <w:szCs w:val="28"/>
-        </w:rPr>
-      </w:r>
-    </w:p>
-    <w:p>
-      <w:pPr>
-        <w:pStyle w:val="Normal"/>
-        <w:jc w:val="center"/>
-        <w:rPr>
-          <w:sz w:val="28"/>
-          <w:szCs w:val="28"/>
-        </w:rPr>
-      </w:pPr>
-      <w:r>
-        <w:rPr>
-          <w:sz w:val="28"/>
-          <w:szCs w:val="28"/>
-        </w:rPr>
-      </w:r>
-    </w:p>
-    <w:p>
-      <w:pPr>
-        <w:pStyle w:val="Normal"/>
-        <w:jc w:val="center"/>
-        <w:rPr>
-          <w:sz w:val="28"/>
-          <w:szCs w:val="28"/>
-        </w:rPr>
-      </w:pPr>
-      <w:r>
-        <w:rPr>
-          <w:sz w:val="28"/>
-          <w:szCs w:val="28"/>
-        </w:rPr>
-      </w:r>
-    </w:p>
-    <w:p>
-      <w:pPr>
-        <w:pStyle w:val="Normal"/>
-        <w:jc w:val="center"/>
-        <w:rPr>
-          <w:sz w:val="28"/>
-          <w:szCs w:val="28"/>
-        </w:rPr>
-      </w:pPr>
-      <w:r>
-        <w:rPr>
-          <w:sz w:val="28"/>
-          <w:szCs w:val="28"/>
-        </w:rPr>
-      </w:r>
-    </w:p>
-    <w:p>
-      <w:pPr>
-        <w:pStyle w:val="Normal"/>
-        <w:jc w:val="center"/>
-        <w:rPr>
-          <w:sz w:val="28"/>
-          <w:szCs w:val="28"/>
-        </w:rPr>
-      </w:pPr>
-      <w:r>
-        <w:rPr>
-          <w:sz w:val="28"/>
-          <w:szCs w:val="28"/>
-        </w:rPr>
-      </w:r>
-    </w:p>
-    <w:p>
-      <w:pPr>
-        <w:pStyle w:val="Normal"/>
-        <w:jc w:val="center"/>
-        <w:rPr>
-          <w:sz w:val="28"/>
-          <w:szCs w:val="28"/>
-        </w:rPr>
-      </w:pPr>
-      <w:r>
-        <w:rPr>
-          <w:sz w:val="28"/>
-          <w:szCs w:val="28"/>
-        </w:rPr>
-      </w:r>
-    </w:p>
-    <w:p>
-      <w:pPr>
-        <w:pStyle w:val="Normal"/>
-        <w:jc w:val="center"/>
-        <w:rPr>
-          <w:b/>
-          <w:sz w:val="36"/>
-          <w:szCs w:val="42"/>
-        </w:rPr>
-      </w:pPr>
-      <w:r>
-        <w:rPr>
-          <w:b/>
-          <w:sz w:val="36"/>
-          <w:szCs w:val="42"/>
-        </w:rPr>
-        <w:t>Chuyên ngành Máy Tính - Hệ Thống Nhúng</w:t>
-      </w:r>
-    </w:p>
-    <w:p>
-      <w:pPr>
-        <w:pStyle w:val="Normal"/>
-        <w:jc w:val="center"/>
-        <w:rPr>
-          <w:b/>
-          <w:sz w:val="28"/>
-          <w:szCs w:val="28"/>
-        </w:rPr>
-      </w:pPr>
-      <w:r>
-        <w:rPr>
-          <w:b/>
-          <w:sz w:val="28"/>
-          <w:szCs w:val="28"/>
-        </w:rPr>
-      </w:r>
-    </w:p>
-    <w:p>
-      <w:pPr>
-        <w:pStyle w:val="Normal"/>
-        <w:jc w:val="center"/>
-        <w:rPr>
-          <w:sz w:val="28"/>
-          <w:szCs w:val="28"/>
-        </w:rPr>
-      </w:pPr>
-      <w:r>
-        <w:rPr>
-          <w:sz w:val="28"/>
-          <w:szCs w:val="28"/>
-        </w:rPr>
-      </w:r>
-    </w:p>
-    <w:p>
-      <w:pPr>
-        <w:pStyle w:val="Normal"/>
-        <w:rPr>
-          <w:sz w:val="28"/>
-          <w:szCs w:val="28"/>
-        </w:rPr>
-      </w:pPr>
-      <w:r>
-        <w:rPr>
-          <w:sz w:val="28"/>
-          <w:szCs w:val="28"/>
-        </w:rPr>
-      </w:r>
-    </w:p>
-    <w:p>
-      <w:pPr>
-        <w:pStyle w:val="Normal"/>
-        <w:rPr>
-          <w:sz w:val="28"/>
-          <w:szCs w:val="28"/>
-        </w:rPr>
-      </w:pPr>
-      <w:r>
-        <w:rPr>
-          <w:sz w:val="28"/>
-          <w:szCs w:val="28"/>
-        </w:rPr>
-      </w:r>
-    </w:p>
-    <w:p>
-      <w:pPr>
-        <w:pStyle w:val="Normal"/>
-        <w:rPr>
-          <w:sz w:val="28"/>
-          <w:szCs w:val="28"/>
-        </w:rPr>
-      </w:pPr>
-      <w:r>
-        <w:rPr>
-          <w:sz w:val="28"/>
-          <w:szCs w:val="28"/>
-        </w:rPr>
-      </w:r>
-    </w:p>
-    <w:p>
-      <w:pPr>
-        <w:pStyle w:val="Normal"/>
-        <w:rPr>
-          <w:sz w:val="28"/>
-          <w:szCs w:val="28"/>
-        </w:rPr>
-      </w:pPr>
-      <w:r>
-        <w:rPr>
-          <w:sz w:val="28"/>
-          <w:szCs w:val="28"/>
-        </w:rPr>
-      </w:r>
-    </w:p>
-    <w:p>
-      <w:pPr>
-        <w:pStyle w:val="Normal"/>
-        <w:jc w:val="center"/>
-        <w:rPr>
-          <w:sz w:val="28"/>
-          <w:szCs w:val="28"/>
-        </w:rPr>
-      </w:pPr>
-      <w:r>
-        <w:rPr>
-          <w:sz w:val="28"/>
-          <w:szCs w:val="28"/>
-        </w:rPr>
-      </w:r>
-    </w:p>
-    <w:p>
-      <w:pPr>
-        <w:pStyle w:val="Normal"/>
-        <w:rPr>
-          <w:sz w:val="28"/>
-          <w:szCs w:val="28"/>
-        </w:rPr>
-      </w:pPr>
-      <w:r>
-        <w:rPr>
-          <w:sz w:val="28"/>
-          <w:szCs w:val="28"/>
-        </w:rPr>
-      </w:r>
-    </w:p>
-    <w:p>
-      <w:pPr>
-        <w:pStyle w:val="Normal"/>
-        <w:rPr>
-          <w:i/>
-          <w:i/>
-          <w:sz w:val="28"/>
-          <w:szCs w:val="28"/>
-        </w:rPr>
-      </w:pPr>
-      <w:r>
-        <w:rPr>
-          <w:i/>
-          <w:sz w:val="28"/>
-          <w:szCs w:val="28"/>
-        </w:rPr>
-        <w:t xml:space="preserve">                                          </w:t>
-      </w:r>
-      <w:r>
-        <w:rPr>
-          <w:b/>
-          <w:sz w:val="28"/>
-          <w:szCs w:val="42"/>
-        </w:rPr>
-        <w:t>TP. Hồ Chí Minh, tháng 08 năm 2026</w:t>
-      </w:r>
-    </w:p>
-    <w:p>
-      <w:pPr>
-        <w:pStyle w:val="Normal"/>
-        <w:jc w:val="center"/>
-        <w:rPr>
-          <w:i/>
-          <w:i/>
-          <w:sz w:val="28"/>
-          <w:szCs w:val="28"/>
-        </w:rPr>
-      </w:pPr>
-      <w:r>
-        <w:rPr>
-          <w:i/>
-          <w:sz w:val="28"/>
-          <w:szCs w:val="28"/>
-        </w:rPr>
-      </w:r>
-    </w:p>
-    <w:p>
-      <w:r>
-        <w:br w:type="page"/>
-      </w:r>
-    </w:p>
-    <w:p>
-      <w:pPr>
-        <w:pStyle w:val="Normal"/>
-        <w:tabs>
-          <w:tab w:val="clear" w:pos="720"/>
-          <w:tab w:val="left" w:pos="3630" w:leader="none"/>
-        </w:tabs>
-        <w:jc w:val="center"/>
-        <w:rPr>
-          <w:rFonts w:ascii="Times New Roman" w:hAnsi="Times New Roman" w:cs="Times New Roman"/>
-          <w:b/>
-          <w:color w:val="000080"/>
-          <w:sz w:val="28"/>
-          <w:szCs w:val="34"/>
-        </w:rPr>
-      </w:pPr>
-      <w:r>
-        <w:drawing>
-          <wp:anchor behindDoc="1" distT="0" distB="0" distL="114935" distR="114935" simplePos="0" locked="0" layoutInCell="1" allowOverlap="1" relativeHeight="2">
-            <wp:simplePos x="0" y="0"/>
-            <wp:positionH relativeFrom="column">
-              <wp:posOffset>20955</wp:posOffset>
-            </wp:positionH>
-            <wp:positionV relativeFrom="paragraph">
-              <wp:posOffset>-838200</wp:posOffset>
-            </wp:positionV>
-            <wp:extent cx="6096000" cy="9334500"/>
-            <wp:effectExtent l="0" t="0" r="0" b="0"/>
-            <wp:wrapNone/>
-            <wp:docPr id="6" name="Image1" descr="" title=""/>
-            <wp:cNvGraphicFramePr>
-              <a:graphicFrameLocks xmlns:a="http://schemas.openxmlformats.org/drawingml/2006/main" noChangeAspect="1"/>
-            </wp:cNvGraphicFramePr>
-            <a:graphic xmlns:a="http://schemas.openxmlformats.org/drawingml/2006/main">
-              <a:graphicData uri="http://schemas.openxmlformats.org/drawingml/2006/picture">
-                <pic:pic xmlns:pic="http://schemas.openxmlformats.org/drawingml/2006/picture">
-                  <pic:nvPicPr>
-                    <pic:cNvPr id="8" name="Image1" descr="" title=""/>
-                    <pic:cNvPicPr>
-                      <a:picLocks noChangeAspect="1" noChangeArrowheads="1"/>
-                    </pic:cNvPicPr>
-                  </pic:nvPicPr>
-                  <pic:blipFill>
-                    <a:blip r:embed="rId11"/>
-                    <a:stretch>
-                      <a:fillRect/>
-                    </a:stretch>
-                  </pic:blipFill>
-                  <pic:spPr bwMode="auto">
-                    <a:xfrm>
-                      <a:off x="0" y="0"/>
-                      <a:ext cx="6096000" cy="9334500"/>
-                    </a:xfrm>
-                    <a:prstGeom prst="rect">
-                      <a:avLst/>
-                    </a:prstGeom>
-                    <a:ln w="38100">
-                      <a:solidFill>
-                        <a:srgbClr val="000000"/>
-                      </a:solidFill>
-                    </a:ln>
-                  </pic:spPr>
-                </pic:pic>
-              </a:graphicData>
-            </a:graphic>
-          </wp:anchor>
-        </w:drawing>
-      </w:r>
-      <w:r>
-        <w:rPr>
-          <w:rFonts w:cs="Times New Roman" w:ascii="Times New Roman" w:hAnsi="Times New Roman"/>
-          <w:b/>
-          <w:color w:val="000080"/>
-          <w:sz w:val="28"/>
-          <w:szCs w:val="34"/>
-        </w:rPr>
-        <w:t>ĐẠI HỌC QUỐC GIA THÀNH PHỐ HỒ CHÍ MINH</w:t>
-      </w:r>
-    </w:p>
-    <w:p>
-      <w:pPr>
-        <w:pStyle w:val="Normal"/>
-        <w:jc w:val="center"/>
-        <w:rPr>
-          <w:rFonts w:ascii="Times New Roman" w:hAnsi="Times New Roman" w:cs="Times New Roman"/>
-          <w:b/>
-          <w:color w:val="000080"/>
-          <w:sz w:val="28"/>
-          <w:szCs w:val="34"/>
-        </w:rPr>
-      </w:pPr>
-      <w:r>
-        <w:rPr>
-          <w:rFonts w:cs="Times New Roman" w:ascii="Times New Roman" w:hAnsi="Times New Roman"/>
-          <w:b/>
-          <w:color w:val="000080"/>
-          <w:sz w:val="28"/>
-          <w:szCs w:val="34"/>
-        </w:rPr>
-        <w:t>TRƯỜNG ĐẠI HỌC KHOA HỌC TỰ NHIÊN</w:t>
-      </w:r>
-    </w:p>
-    <w:p>
-      <w:pPr>
-        <w:pStyle w:val="Normal"/>
-        <w:jc w:val="center"/>
-        <w:rPr>
-          <w:rFonts w:ascii="Times New Roman" w:hAnsi="Times New Roman" w:cs="Times New Roman"/>
-          <w:b/>
-          <w:color w:val="000080"/>
-          <w:sz w:val="28"/>
-          <w:szCs w:val="34"/>
-        </w:rPr>
-      </w:pPr>
-      <w:r>
-        <w:rPr>
-          <w:rFonts w:cs="Times New Roman" w:ascii="Times New Roman" w:hAnsi="Times New Roman"/>
-          <w:b/>
-          <w:color w:val="000080"/>
-          <w:sz w:val="28"/>
-          <w:szCs w:val="34"/>
-        </w:rPr>
-        <w:t>KHOA ĐIỆN TỬ - VIỄN THÔNG</w:t>
-      </w:r>
-    </w:p>
-    <w:p>
-      <w:pPr>
-        <w:pStyle w:val="Normal"/>
-        <w:tabs>
-          <w:tab w:val="clear" w:pos="720"/>
-          <w:tab w:val="left" w:pos="3630" w:leader="none"/>
-        </w:tabs>
-        <w:jc w:val="center"/>
-        <w:rPr>
-          <w:rFonts w:ascii="Times New Roman" w:hAnsi="Times New Roman" w:cs="Times New Roman"/>
-          <w:b/>
-          <w:bCs/>
-          <w:sz w:val="22"/>
-          <w:szCs w:val="28"/>
-        </w:rPr>
-      </w:pPr>
-      <w:r>
-        <w:rPr>
-          <w:rFonts w:cs="Times New Roman" w:ascii="Times New Roman" w:hAnsi="Times New Roman"/>
-          <w:b/>
-          <w:color w:val="000080"/>
-          <w:sz w:val="28"/>
-          <w:szCs w:val="34"/>
-        </w:rPr>
-        <w:t>BỘ MÔN MÁY TÍNH - HỆ THỐNG NHÚNG</w:t>
-      </w:r>
-    </w:p>
-    <w:p>
-      <w:pPr>
-        <w:pStyle w:val="Normal"/>
-        <w:jc w:val="center"/>
-        <w:rPr>
-          <w:color w:val="943634"/>
-          <w:sz w:val="28"/>
-          <w:szCs w:val="28"/>
-        </w:rPr>
-      </w:pPr>
-      <w:r>
-        <w:rPr>
-          <w:rFonts w:eastAsia="Wingdings" w:cs="Wingdings" w:ascii="Wingdings" w:hAnsi="Wingdings"/>
-          <w:color w:val="943634"/>
-          <w:sz w:val="28"/>
-          <w:szCs w:val="28"/>
-        </w:rPr>
-        <w:sym w:font="Wingdings" w:char="f096"/>
-        <w:sym w:font="Wingdings" w:char="f026"/>
-        <w:sym w:font="Wingdings" w:char="f097"/>
-      </w:r>
-    </w:p>
-    <w:p>
-      <w:pPr>
-        <w:pStyle w:val="Normal"/>
-        <w:tabs>
-          <w:tab w:val="clear" w:pos="720"/>
-          <w:tab w:val="left" w:pos="3630" w:leader="none"/>
-        </w:tabs>
-        <w:jc w:val="center"/>
-        <w:rPr>
-          <w:rFonts w:ascii="Times New Roman" w:hAnsi="Times New Roman" w:cs="Times New Roman"/>
-          <w:b/>
-          <w:bCs/>
-          <w:color w:val="943634"/>
-          <w:sz w:val="30"/>
-          <w:szCs w:val="30"/>
-        </w:rPr>
-      </w:pPr>
-      <w:r>
-        <w:rPr>
-          <w:rFonts w:cs="Times New Roman" w:ascii="Times New Roman" w:hAnsi="Times New Roman"/>
-          <w:b/>
-          <w:bCs/>
-          <w:color w:val="943634"/>
-          <w:sz w:val="30"/>
-          <w:szCs w:val="30"/>
-        </w:rPr>
-      </w:r>
-    </w:p>
-    <w:p>
-      <w:pPr>
-        <w:pStyle w:val="Normal"/>
-        <w:tabs>
-          <w:tab w:val="clear" w:pos="720"/>
-          <w:tab w:val="left" w:pos="3630" w:leader="none"/>
-        </w:tabs>
-        <w:jc w:val="center"/>
-        <w:rPr>
-          <w:rFonts w:ascii="Times New Roman" w:hAnsi="Times New Roman" w:cs="Times New Roman"/>
-          <w:b/>
-          <w:bCs/>
-          <w:sz w:val="28"/>
-          <w:szCs w:val="28"/>
-        </w:rPr>
-      </w:pPr>
-      <w:r>
-        <w:rPr>
-          <w:rFonts w:cs="Times New Roman" w:ascii="Times New Roman" w:hAnsi="Times New Roman"/>
-          <w:b/>
-          <w:bCs/>
-          <w:sz w:val="28"/>
-          <w:szCs w:val="28"/>
-        </w:rPr>
-      </w:r>
-    </w:p>
-    <w:p>
-      <w:pPr>
-        <w:pStyle w:val="Normal"/>
-        <w:jc w:val="center"/>
-        <w:rPr>
-          <w:b/>
-          <w:color w:val="993366"/>
-          <w:sz w:val="32"/>
-        </w:rPr>
-      </w:pPr>
-      <w:r>
-        <w:rPr>
-          <w:b/>
-          <w:color w:val="993366"/>
-          <w:sz w:val="32"/>
-        </w:rPr>
-        <w:t>NGUY</w:t>
-      </w:r>
-      <w:r>
-        <w:rPr>
-          <w:rFonts w:cs="Times New Roman" w:ascii="Times New Roman" w:hAnsi="Times New Roman"/>
-          <w:b/>
-          <w:color w:val="993366"/>
-          <w:sz w:val="32"/>
-        </w:rPr>
-        <w:t>Ễ</w:t>
-      </w:r>
-      <w:r>
-        <w:rPr>
-          <w:b/>
-          <w:color w:val="993366"/>
-          <w:sz w:val="32"/>
-        </w:rPr>
-        <w:t>N V</w:t>
-      </w:r>
-      <w:r>
-        <w:rPr>
-          <w:rFonts w:cs="Times New Roman" w:ascii="Times New Roman" w:hAnsi="Times New Roman"/>
-          <w:b/>
-          <w:color w:val="993366"/>
-          <w:sz w:val="32"/>
-        </w:rPr>
-        <w:t>Ă</w:t>
-      </w:r>
-      <w:r>
-        <w:rPr>
-          <w:b/>
-          <w:color w:val="993366"/>
-          <w:sz w:val="32"/>
-        </w:rPr>
-        <w:t>N A</w:t>
-      </w:r>
-    </w:p>
-    <w:p>
-      <w:pPr>
-        <w:pStyle w:val="Normal"/>
-        <w:jc w:val="center"/>
-        <w:rPr>
-          <w:b/>
-          <w:bCs/>
-          <w:sz w:val="52"/>
-          <w:szCs w:val="52"/>
-        </w:rPr>
-      </w:pPr>
-      <w:r>
-        <w:rPr>
-          <w:b/>
-          <w:color w:val="993366"/>
-          <w:sz w:val="32"/>
-        </w:rPr>
-        <w:t>1220012</w:t>
-      </w:r>
-    </w:p>
-    <w:p>
-      <w:pPr>
-        <w:pStyle w:val="Normal"/>
-        <w:jc w:val="center"/>
-        <w:rPr>
-          <w:b/>
-          <w:bCs/>
-          <w:sz w:val="52"/>
-          <w:szCs w:val="52"/>
-        </w:rPr>
-      </w:pPr>
-      <w:r>
-        <w:rPr>
-          <w:b/>
-          <w:bCs/>
-          <w:sz w:val="52"/>
-          <w:szCs w:val="52"/>
-        </w:rPr>
-      </w:r>
-    </w:p>
-    <w:p>
-      <w:pPr>
-        <w:pStyle w:val="Normal"/>
-        <w:rPr>
-          <w:rFonts w:ascii="Times New Roman" w:hAnsi="Times New Roman" w:cs="Times New Roman"/>
-          <w:b/>
-          <w:sz w:val="32"/>
-          <w:szCs w:val="32"/>
-        </w:rPr>
-      </w:pPr>
-      <w:r>
-        <w:rPr>
-          <w:rFonts w:cs="Times New Roman" w:ascii="Times New Roman" w:hAnsi="Times New Roman"/>
-          <w:b/>
-          <w:sz w:val="32"/>
-          <w:szCs w:val="32"/>
-        </w:rPr>
-        <w:t xml:space="preserve">     </w:t>
-      </w:r>
-      <w:r>
-        <w:rPr>
-          <w:rFonts w:cs="Times New Roman" w:ascii="Times New Roman" w:hAnsi="Times New Roman"/>
-          <w:b/>
-          <w:i/>
-          <w:color w:val="000080"/>
-          <w:sz w:val="30"/>
-          <w:u w:val="single"/>
-        </w:rPr>
-        <w:t>Đề tài:</w:t>
-      </w:r>
-    </w:p>
-    <w:p>
-      <w:pPr>
-        <w:pStyle w:val="Normal"/>
-        <w:jc w:val="center"/>
-        <w:rPr>
-          <w:rFonts w:ascii="Times New Roman" w:hAnsi="Times New Roman" w:cs="Times New Roman"/>
-          <w:b/>
-          <w:sz w:val="28"/>
-          <w:szCs w:val="28"/>
-        </w:rPr>
-      </w:pPr>
-      <w:r>
-        <w:rPr>
-          <w:rFonts w:cs="Times New Roman" w:ascii="Times New Roman" w:hAnsi="Times New Roman"/>
-          <w:b/>
-          <w:sz w:val="28"/>
-          <w:szCs w:val="28"/>
-        </w:rPr>
-      </w:r>
-    </w:p>
-    <w:p>
-      <w:pPr>
-        <w:pStyle w:val="Normal"/>
-        <w:jc w:val="center"/>
-        <w:rPr/>
-      </w:pPr>
-      <w:r>
-        <w:rPr>
-          <w:rFonts w:cs="Times New Roman" w:ascii="Times New Roman" w:hAnsi="Times New Roman"/>
-          <w:b/>
-          <w:sz w:val="40"/>
-          <w:szCs w:val="40"/>
-        </w:rPr>
-        <w:t xml:space="preserve"> </w:t>
-      </w:r>
-      <w:r>
-        <w:rPr>
-          <w:rFonts w:cs="Times New Roman" w:ascii="Times New Roman" w:hAnsi="Times New Roman"/>
-          <w:b/>
-          <w:color w:val="993366"/>
-          <w:sz w:val="36"/>
-        </w:rPr>
-        <w:t>QUY TRÌNH THIẾT KẾ VI MẠCH TÍCH HỢP</w:t>
-      </w:r>
-    </w:p>
-    <w:p>
-      <w:pPr>
-        <w:pStyle w:val="Normal"/>
-        <w:jc w:val="center"/>
-        <w:rPr>
-          <w:rFonts w:ascii="Times New Roman" w:hAnsi="Times New Roman" w:cs="Times New Roman"/>
-          <w:b/>
-          <w:sz w:val="40"/>
-          <w:szCs w:val="40"/>
-        </w:rPr>
-      </w:pPr>
-      <w:r>
-        <w:rPr>
-          <w:rFonts w:cs="Times New Roman" w:ascii="Times New Roman" w:hAnsi="Times New Roman"/>
-          <w:b/>
-          <w:color w:val="993366"/>
-          <w:sz w:val="36"/>
-        </w:rPr>
-        <w:t>ỨNG DỤNG KỸ THUẬT DESIGN FOR TEST</w:t>
-      </w:r>
-    </w:p>
-    <w:p>
-      <w:pPr>
-        <w:pStyle w:val="Normal"/>
-        <w:jc w:val="center"/>
-        <w:rPr>
-          <w:rFonts w:ascii="Times New Roman" w:hAnsi="Times New Roman" w:cs="Times New Roman"/>
-          <w:b/>
-          <w:sz w:val="40"/>
-          <w:szCs w:val="40"/>
-        </w:rPr>
-      </w:pPr>
-      <w:r>
-        <w:rPr>
-          <w:rFonts w:cs="Times New Roman" w:ascii="Times New Roman" w:hAnsi="Times New Roman"/>
-          <w:b/>
-          <w:sz w:val="40"/>
-          <w:szCs w:val="40"/>
-        </w:rPr>
-      </w:r>
-    </w:p>
-    <w:p>
-      <w:pPr>
-        <w:pStyle w:val="Normal"/>
-        <w:tabs>
-          <w:tab w:val="clear" w:pos="720"/>
-          <w:tab w:val="left" w:pos="3360" w:leader="none"/>
-          <w:tab w:val="left" w:pos="4800" w:leader="none"/>
-        </w:tabs>
-        <w:spacing w:before="80" w:after="80"/>
-        <w:jc w:val="center"/>
-        <w:rPr>
-          <w:rFonts w:ascii="Times New Roman" w:hAnsi="Times New Roman" w:cs="Times New Roman"/>
-          <w:b/>
-          <w:color w:val="000080"/>
-          <w:sz w:val="30"/>
-          <w:szCs w:val="30"/>
-        </w:rPr>
-      </w:pPr>
-      <w:r>
-        <w:rPr>
-          <w:rFonts w:cs="Times New Roman" w:ascii="Times New Roman" w:hAnsi="Times New Roman"/>
-          <w:b/>
-          <w:color w:val="000080"/>
-          <w:sz w:val="30"/>
-          <w:szCs w:val="30"/>
-        </w:rPr>
-        <w:t xml:space="preserve">INTEGRATED CIRCUIT DESIGN PROCESS </w:t>
-      </w:r>
-    </w:p>
-    <w:p>
-      <w:pPr>
-        <w:pStyle w:val="Normal"/>
-        <w:tabs>
-          <w:tab w:val="clear" w:pos="720"/>
-          <w:tab w:val="left" w:pos="3360" w:leader="none"/>
-          <w:tab w:val="left" w:pos="4800" w:leader="none"/>
-        </w:tabs>
-        <w:spacing w:before="80" w:after="80"/>
-        <w:jc w:val="center"/>
-        <w:rPr>
-          <w:rFonts w:ascii="Times New Roman" w:hAnsi="Times New Roman" w:cs="Times New Roman"/>
-          <w:b/>
-          <w:color w:val="000080"/>
-          <w:sz w:val="30"/>
-          <w:szCs w:val="30"/>
-        </w:rPr>
-      </w:pPr>
-      <w:r>
-        <w:rPr>
-          <w:rFonts w:cs="Times New Roman" w:ascii="Times New Roman" w:hAnsi="Times New Roman"/>
-          <w:b/>
-          <w:color w:val="000080"/>
-          <w:sz w:val="30"/>
-          <w:szCs w:val="30"/>
-        </w:rPr>
-        <w:t>USING DESIGN FOR TEST TECHNIQUE</w:t>
-      </w:r>
-    </w:p>
-    <w:p>
-      <w:pPr>
-        <w:pStyle w:val="Normal"/>
-        <w:jc w:val="center"/>
-        <w:rPr>
-          <w:rFonts w:ascii="Times New Roman" w:hAnsi="Times New Roman" w:cs="Times New Roman"/>
-          <w:b/>
-          <w:color w:val="000080"/>
-          <w:sz w:val="40"/>
-          <w:szCs w:val="40"/>
-        </w:rPr>
-      </w:pPr>
-      <w:r>
-        <w:rPr>
-          <w:rFonts w:cs="Times New Roman" w:ascii="Times New Roman" w:hAnsi="Times New Roman"/>
-          <w:b/>
-          <w:color w:val="000080"/>
-          <w:sz w:val="40"/>
-          <w:szCs w:val="40"/>
-        </w:rPr>
-      </w:r>
-    </w:p>
-    <w:p>
-      <w:pPr>
-        <w:pStyle w:val="Normal"/>
-        <w:jc w:val="center"/>
-        <w:rPr>
-          <w:rFonts w:ascii="Times New Roman" w:hAnsi="Times New Roman" w:cs="Times New Roman"/>
-          <w:b/>
-          <w:sz w:val="40"/>
-          <w:szCs w:val="40"/>
-        </w:rPr>
-      </w:pPr>
-      <w:r>
-        <w:rPr>
-          <w:rFonts w:cs="Times New Roman" w:ascii="Times New Roman" w:hAnsi="Times New Roman"/>
-          <w:b/>
-          <w:sz w:val="40"/>
-          <w:szCs w:val="40"/>
-        </w:rPr>
-      </w:r>
-    </w:p>
-    <w:p>
-      <w:pPr>
-        <w:pStyle w:val="Normal"/>
-        <w:jc w:val="center"/>
-        <w:rPr>
-          <w:rFonts w:ascii="Times New Roman" w:hAnsi="Times New Roman" w:cs="Times New Roman"/>
-          <w:b/>
-          <w:color w:val="000080"/>
-        </w:rPr>
-      </w:pPr>
-      <w:r>
-        <w:rPr>
-          <w:rFonts w:cs="Times New Roman" w:ascii="Times New Roman" w:hAnsi="Times New Roman"/>
-          <w:b/>
-          <w:color w:val="000080"/>
-        </w:rPr>
-        <w:t>KHÓA LUẬN TỐT NGHIỆP CỬ NHÂN</w:t>
-      </w:r>
-    </w:p>
-    <w:p>
-      <w:pPr>
-        <w:pStyle w:val="Normal"/>
-        <w:jc w:val="center"/>
-        <w:rPr/>
-      </w:pPr>
-      <w:r>
-        <w:rPr>
-          <w:rFonts w:cs="Times New Roman" w:ascii="Times New Roman" w:hAnsi="Times New Roman"/>
-          <w:b/>
-          <w:color w:val="000080"/>
-        </w:rPr>
-        <w:t>NGÀNH KỸ THUẬT ĐIỆN TỬ - VIỄN THÔNG</w:t>
-      </w:r>
-    </w:p>
-    <w:p>
-      <w:pPr>
-        <w:pStyle w:val="Normal"/>
-        <w:jc w:val="center"/>
-        <w:rPr>
-          <w:rFonts w:ascii="Times New Roman" w:hAnsi="Times New Roman" w:cs="Times New Roman"/>
-          <w:b/>
-          <w:color w:val="000080"/>
-        </w:rPr>
-      </w:pPr>
-      <w:r>
-        <w:rPr>
-          <w:rFonts w:cs="Times New Roman" w:ascii="Times New Roman" w:hAnsi="Times New Roman"/>
-          <w:b/>
-          <w:color w:val="000080"/>
-        </w:rPr>
-        <w:t>CHUYÊN NGÀNH MÁY TÍNH - HỆ THỐNG NHÚNG</w:t>
-      </w:r>
-    </w:p>
-    <w:p>
-      <w:pPr>
-        <w:pStyle w:val="Normal"/>
-        <w:spacing w:before="0" w:after="200"/>
-        <w:rPr>
-          <w:rFonts w:ascii="Times New Roman" w:hAnsi="Times New Roman" w:cs="Times New Roman"/>
-          <w:b/>
-          <w:color w:val="000080"/>
-          <w:sz w:val="32"/>
-          <w:szCs w:val="32"/>
-        </w:rPr>
-      </w:pPr>
-      <w:r>
-        <w:rPr>
-          <w:rFonts w:cs="Times New Roman" w:ascii="Times New Roman" w:hAnsi="Times New Roman"/>
-          <w:b/>
-          <w:color w:val="000080"/>
-          <w:sz w:val="32"/>
-          <w:szCs w:val="32"/>
-        </w:rPr>
-      </w:r>
-    </w:p>
-    <w:p>
-      <w:pPr>
-        <w:pStyle w:val="Normal"/>
-        <w:spacing w:before="0" w:after="200"/>
-        <w:rPr>
-          <w:rFonts w:ascii="Times New Roman" w:hAnsi="Times New Roman" w:cs="Times New Roman"/>
-          <w:b/>
-          <w:sz w:val="32"/>
-          <w:szCs w:val="32"/>
-        </w:rPr>
-      </w:pPr>
-      <w:r>
-        <w:rPr>
-          <w:rFonts w:cs="Times New Roman" w:ascii="Times New Roman" w:hAnsi="Times New Roman"/>
-          <w:b/>
-          <w:sz w:val="32"/>
-          <w:szCs w:val="32"/>
-        </w:rPr>
-      </w:r>
-    </w:p>
-    <w:p>
-      <w:pPr>
-        <w:pStyle w:val="Normal"/>
-        <w:jc w:val="center"/>
-        <w:rPr>
-          <w:rFonts w:ascii="Times New Roman" w:hAnsi="Times New Roman" w:cs="Times New Roman"/>
-          <w:b/>
-          <w:color w:val="000080"/>
-          <w:sz w:val="32"/>
-          <w:szCs w:val="32"/>
-        </w:rPr>
-      </w:pPr>
-      <w:r>
-        <w:rPr>
-          <w:rFonts w:cs="Times New Roman" w:ascii="Times New Roman" w:hAnsi="Times New Roman"/>
-          <w:b/>
-          <w:color w:val="000080"/>
-          <w:sz w:val="32"/>
-          <w:szCs w:val="32"/>
-        </w:rPr>
-      </w:r>
-    </w:p>
-    <w:p>
-      <w:pPr>
-        <w:pStyle w:val="Normal"/>
-        <w:jc w:val="center"/>
-        <w:rPr>
-          <w:rFonts w:ascii="Times New Roman" w:hAnsi="Times New Roman" w:cs="Times New Roman"/>
-          <w:color w:val="000080"/>
-        </w:rPr>
-      </w:pPr>
-      <w:r>
-        <w:rPr>
-          <w:rFonts w:cs="Times New Roman" w:ascii="Times New Roman" w:hAnsi="Times New Roman"/>
-          <w:color w:val="000080"/>
-        </w:rPr>
-        <w:t>NGƯỜI HƯỚNG DẪN KHOA HỌC</w:t>
-      </w:r>
-    </w:p>
-    <w:p>
-      <w:pPr>
-        <w:pStyle w:val="Normal"/>
-        <w:spacing w:before="0" w:after="200"/>
-        <w:jc w:val="center"/>
-        <w:rPr>
-          <w:rFonts w:ascii="Times New Roman" w:hAnsi="Times New Roman" w:cs="Times New Roman"/>
-          <w:b/>
-          <w:color w:val="000080"/>
-        </w:rPr>
-      </w:pPr>
-      <w:r>
-        <w:rPr>
-          <w:rFonts w:cs="Times New Roman" w:ascii="Times New Roman" w:hAnsi="Times New Roman"/>
-          <w:b/>
-          <w:color w:val="000080"/>
-        </w:rPr>
-        <w:t>ThS.</w:t>
-        <w:tab/>
-        <w:t>TRẦN VĂN B</w:t>
-      </w:r>
-    </w:p>
-    <w:p>
-      <w:pPr>
-        <w:pStyle w:val="Normal"/>
-        <w:spacing w:before="0" w:after="200"/>
-        <w:jc w:val="center"/>
-        <w:rPr>
-          <w:rFonts w:ascii="Times New Roman" w:hAnsi="Times New Roman" w:cs="Times New Roman"/>
-          <w:b/>
-          <w:color w:val="000080"/>
-        </w:rPr>
-      </w:pPr>
-      <w:r>
-        <w:rPr>
-          <w:rFonts w:cs="Times New Roman" w:ascii="Times New Roman" w:hAnsi="Times New Roman"/>
-          <w:b/>
-          <w:color w:val="000080"/>
-        </w:rPr>
-      </w:r>
-    </w:p>
-    <w:p>
-      <w:pPr>
-        <w:pStyle w:val="Normal"/>
-        <w:spacing w:before="0" w:after="200"/>
-        <w:jc w:val="center"/>
-        <w:rPr>
-          <w:rFonts w:ascii="Times New Roman" w:hAnsi="Times New Roman" w:cs="Times New Roman"/>
-          <w:b/>
-          <w:color w:val="000080"/>
-        </w:rPr>
-      </w:pPr>
-      <w:r>
-        <w:rPr>
-          <w:rFonts w:cs="Times New Roman" w:ascii="Times New Roman" w:hAnsi="Times New Roman"/>
-          <w:b/>
-          <w:color w:val="000080"/>
-        </w:rPr>
-      </w:r>
-    </w:p>
-    <w:p>
-      <w:pPr>
-        <w:pStyle w:val="Normal"/>
-        <w:spacing w:before="0" w:after="200"/>
-        <w:jc w:val="center"/>
-        <w:rPr>
-          <w:rFonts w:ascii="Times New Roman" w:hAnsi="Times New Roman" w:cs="Times New Roman"/>
-          <w:b/>
-          <w:color w:val="000080"/>
-        </w:rPr>
-      </w:pPr>
-      <w:r>
-        <w:rPr>
-          <w:rFonts w:cs="Times New Roman" w:ascii="Times New Roman" w:hAnsi="Times New Roman"/>
-          <w:b/>
-          <w:color w:val="000080"/>
-        </w:rPr>
-      </w:r>
-    </w:p>
-    <w:p>
-      <w:pPr>
-        <w:pStyle w:val="Normal"/>
-        <w:spacing w:before="0" w:after="200"/>
-        <w:jc w:val="center"/>
-        <w:rPr>
-          <w:rFonts w:ascii="Times New Roman" w:hAnsi="Times New Roman" w:cs="Times New Roman"/>
-          <w:b/>
-          <w:sz w:val="32"/>
-          <w:szCs w:val="32"/>
-        </w:rPr>
-      </w:pPr>
-      <w:r>
-        <w:rPr>
-          <w:rFonts w:cs="Times New Roman" w:ascii="Times New Roman" w:hAnsi="Times New Roman"/>
-          <w:b/>
-          <w:color w:val="000080"/>
-        </w:rPr>
-        <w:t>TP. Hồ Chí Minh, tháng 08 năm 2026</w:t>
-      </w:r>
-    </w:p>
-    <w:p>
-      <w:pPr>
-        <w:pStyle w:val="Normal"/>
-        <w:spacing w:before="0" w:after="200"/>
-        <w:jc w:val="center"/>
-        <w:rPr>
-          <w:rFonts w:ascii="Times New Roman" w:hAnsi="Times New Roman" w:cs="Times New Roman"/>
-          <w:b/>
-          <w:sz w:val="32"/>
-          <w:szCs w:val="32"/>
-        </w:rPr>
-      </w:pPr>
-      <w:r>
-        <w:rPr>
-          <w:rFonts w:cs="Times New Roman" w:ascii="Times New Roman" w:hAnsi="Times New Roman"/>
-          <w:b/>
-          <w:sz w:val="32"/>
-          <w:szCs w:val="32"/>
-        </w:rPr>
-      </w:r>
-    </w:p>
-    <w:p>
-      <w:pPr>
-        <w:pStyle w:val="Normal"/>
-        <w:jc w:val="center"/>
-        <w:rPr>
-          <w:rFonts w:ascii="Times New Roman" w:hAnsi="Times New Roman" w:cs="Times New Roman"/>
-          <w:b/>
-          <w:sz w:val="28"/>
-          <w:szCs w:val="28"/>
-        </w:rPr>
-      </w:pPr>
-      <w:r>
-        <w:rPr>
-          <w:rFonts w:cs="Times New Roman" w:ascii="Times New Roman" w:hAnsi="Times New Roman"/>
-          <w:b/>
-          <w:sz w:val="28"/>
-          <w:szCs w:val="28"/>
-        </w:rPr>
-        <w:t xml:space="preserve"> </w:t>
-      </w:r>
-    </w:p>
-    <w:p>
-      <w:r>
-        <w:br w:type="page"/>
-      </w:r>
-    </w:p>
+        </w:rPr>
+        <w:t>Sinh viên thực hiện</w:t>
+      </w:r>
+    </w:p>
+    <w:p>
+      <w:pPr>
+        <w:jc w:val="right"/>
+      </w:pPr>
+      <w:r>
+        <w:rPr>
+          <w:b/>
+        </w:rPr>
+        <w:t>Cao Trọng Phước</w:t>
+      </w:r>
+    </w:p>
+    <w:p/>
     <w:p>
       <w:pPr>
         <w:pStyle w:val="Heading1"/>
@@ -3646,7 +2012,7 @@
         <w:pStyle w:val="ListNumber"/>
         <w:numPr>
           <w:ilvl w:val="0"/>
-          <w:numId w:val="6"/>
+          <w:numId w:val="5"/>
         </w:numPr>
       </w:pPr>
       <w:r>
@@ -4341,7 +2707,7 @@
         <w:rPr>
           <w:b/>
         </w:rPr>
-        <w:t>Chương 1 -- Giới thiệu:</w:t>
+        <w:t>Chương 1 – Giới thiệu:</w:t>
       </w:r>
       <w:r>
         <w:t xml:space="preserve"> Bối cảnh, động lực thực hiện, mục tiêu nghiên cứu, phạm vi, công cụ và cấu trúc khoá luận.</w:t>
@@ -4355,7 +2721,7 @@
         <w:rPr>
           <w:b/>
         </w:rPr>
-        <w:t>Chương 2 -- Tổng quan nghiên cứu:</w:t>
+        <w:t>Chương 2 – Tổng quan nghiên cứu:</w:t>
       </w:r>
       <w:r>
         <w:t xml:space="preserve"> Các phương pháp định vị trong nhà hiện có (fingerprinting, BLE, UWB), so sánh giải pháp thương mại (Estimote, Kontakt.io, Aruba Meridian), các nghiên cứu học thuật liên quan và khoảng trống cần lấp.</w:t>
@@ -4369,7 +2735,7 @@
         <w:rPr>
           <w:b/>
         </w:rPr>
-        <w:t>Chương 3 -- Cơ sở lý thuyết:</w:t>
+        <w:t>Chương 3 – Cơ sở lý thuyết:</w:t>
       </w:r>
       <w:r>
         <w:t xml:space="preserve"> BLE Advertising và RSSI, giao thức BLE Mesh (provisioner, node, keys, opcode), thuật toán xử lý tín hiệu (Kalman filter, path-loss), thuật toán quyết định zone (hysteresis, leaky-bucket debounce), bảo mật (HMAC, key rotation), OTA, giao thức MQTT/HTTP/TLS và ThingsBoard Gateway API.</w:t>
@@ -4383,7 +2749,7 @@
         <w:rPr>
           <w:b/>
         </w:rPr>
-        <w:t>Chương 4 -- Triển khai hệ thống:</w:t>
+        <w:t>Chương 4 – Triển khai hệ thống:</w:t>
       </w:r>
       <w:r>
         <w:t xml:space="preserve"> Kiến trúc tổng thể; firmware của bốn loại node (Tag, Scanner, Relay, Gateway); cấu hình server ThingsBoard (Docker, rule chain, dashboard); bảo mật end-to-end; cơ chế OTA; cấu trúc mã nguồn.</w:t>
@@ -4397,7 +2763,7 @@
         <w:rPr>
           <w:b/>
         </w:rPr>
-        <w:t>Chương 5 -- Kết quả thực nghiệm:</w:t>
+        <w:t>Chương 5 – Kết quả thực nghiệm:</w:t>
       </w:r>
       <w:r>
         <w:t xml:space="preserve"> Thiết lập môi trường thí nghiệm, các kịch bản kiểm thử (bring-up, độ chính xác định vị, chống nhiễu tại biên phòng, self-healing, OTA, bảo mật beacon), đánh giá tổng.</w:t>
@@ -4411,7 +2777,7 @@
         <w:rPr>
           <w:b/>
         </w:rPr>
-        <w:t>Chương 6 -- Kết luận:</w:t>
+        <w:t>Chương 6 – Kết luận:</w:t>
       </w:r>
       <w:r>
         <w:t xml:space="preserve"> Tóm tắt đóng góp chính của đề tài, hạn chế còn tồn tại và hướng phát triển tiếp theo.</w:t>
@@ -5942,7 +4308,7 @@
           <w:rFonts w:ascii="Consolas" w:hAnsi="Consolas"/>
           <w:sz w:val="22"/>
         </w:rPr>
-        <w:t>tx\_power</w:t>
+        <w:t>tx_power</w:t>
       </w:r>
       <w:r>
         <w:t xml:space="preserve"> là RSSI đo được ở đúng 1 m, calibrate lúc lắp đặt — input cho công thức tính khoảng cách. </w:t>
@@ -6737,7 +5103,7 @@
           <w:rFonts w:ascii="Consolas" w:hAnsi="Consolas"/>
           <w:sz w:val="22"/>
         </w:rPr>
-        <w:t>tx\_power</w:t>
+        <w:t>tx_power</w:t>
       </w:r>
       <w:r>
         <w:t xml:space="preserve"> trong payload beacon, </w:t>
@@ -6919,7 +5285,7 @@
         <w:rPr>
           <w:i/>
         </w:rPr>
-        <w:t>Low Power Node -- LPN</w:t>
+        <w:t>Low Power Node – LPN</w:t>
       </w:r>
       <w:r>
         <w:t xml:space="preserve"> (tiết kiệm pin cực đại). Đề tài không dùng Friend/LPN vì mọi node đều cắm điện; Relay được bật trên tất cả node để tăng khả năng phủ; Proxy để mặc định cho tiện debug.</w:t>
@@ -7003,7 +5369,7 @@
           <w:rFonts w:ascii="Consolas" w:hAnsi="Consolas"/>
           <w:sz w:val="22"/>
         </w:rPr>
-        <w:t>esp\_fill\_random()</w:t>
+        <w:t>esp_fill_random()</w:t>
       </w:r>
       <w:r>
         <w:t xml:space="preserve"> khi Gateway boot lần đầu, lưu NVS.</w:t>
@@ -7238,7 +5604,7 @@
                 <w:rFonts w:ascii="Consolas" w:hAnsi="Consolas"/>
                 <w:sz w:val="22"/>
               </w:rPr>
-              <w:t>TAG\_STATUS</w:t>
+              <w:t>TAG_STATUS</w:t>
             </w:r>
           </w:p>
         </w:tc>
@@ -7292,7 +5658,7 @@
                 <w:rFonts w:ascii="Consolas" w:hAnsi="Consolas"/>
                 <w:sz w:val="22"/>
               </w:rPr>
-              <w:t>RESET\_CMD</w:t>
+              <w:t>RESET_CMD</w:t>
             </w:r>
           </w:p>
         </w:tc>
@@ -7346,7 +5712,7 @@
                 <w:rFonts w:ascii="Consolas" w:hAnsi="Consolas"/>
                 <w:sz w:val="22"/>
               </w:rPr>
-              <w:t>OTA\_TRIGGER</w:t>
+              <w:t>OTA_TRIGGER</w:t>
             </w:r>
           </w:p>
         </w:tc>
@@ -7400,7 +5766,7 @@
                 <w:rFonts w:ascii="Consolas" w:hAnsi="Consolas"/>
                 <w:sz w:val="22"/>
               </w:rPr>
-              <w:t>OTA\_RESULT</w:t>
+              <w:t>OTA_RESULT</w:t>
             </w:r>
           </w:p>
         </w:tc>
@@ -7454,7 +5820,7 @@
                 <w:rFonts w:ascii="Consolas" w:hAnsi="Consolas"/>
                 <w:sz w:val="22"/>
               </w:rPr>
-              <w:t>OTA\_KEY\_PUSH</w:t>
+              <w:t>OTA_KEY_PUSH</w:t>
             </w:r>
           </w:p>
         </w:tc>
@@ -8964,7 +7330,7 @@
           <w:rFonts w:ascii="Consolas" w:hAnsi="Consolas"/>
           <w:sz w:val="22"/>
         </w:rPr>
-        <w:t>last\_sequence</w:t>
+        <w:t>last_sequence</w:t>
       </w:r>
       <w:r>
         <w:t xml:space="preserve"> cho từng tag, áp dụng:</w:t>
@@ -8982,7 +7348,7 @@
           <w:rFonts w:ascii="Consolas" w:hAnsi="Consolas"/>
           <w:sz w:val="22"/>
         </w:rPr>
-        <w:t>sequence == last\_sequence</w:t>
+        <w:t>sequence == last_sequence</w:t>
       </w:r>
       <w:r>
         <w:t>: gói trùng (do đa đường truyền hoặc scanner nhận 2 lần). Bỏ qua.</w:t>
@@ -9071,7 +7437,7 @@
           <w:rFonts w:ascii="Consolas" w:hAnsi="Consolas"/>
           <w:sz w:val="22"/>
         </w:rPr>
-        <w:t>last\_sequence</w:t>
+        <w:t>last_sequence</w:t>
       </w:r>
       <w:r>
         <w:t>.</w:t>
@@ -9266,7 +7632,7 @@
           <w:rFonts w:ascii="Consolas" w:hAnsi="Consolas"/>
           <w:sz w:val="22"/>
         </w:rPr>
-        <w:t>HYSTERESIS\_DBM</w:t>
+        <w:t>HYSTERESIS_DBM</w:t>
       </w:r>
       <w:r>
         <w:t xml:space="preserve"> dBm. Đề tài chọn </w:t>
@@ -9276,7 +7642,7 @@
           <w:rFonts w:ascii="Consolas" w:hAnsi="Consolas"/>
           <w:sz w:val="22"/>
         </w:rPr>
-        <w:t>HYSTERESIS\_DBM = 8</w:t>
+        <w:t>HYSTERESIS_DBM = 8</w:t>
       </w:r>
       <w:r>
         <w:t xml:space="preserve"> — thoả hiệp giữa chống flap và tốc độ phản hồi khi thật sự đổi phòng.</w:t>
@@ -9321,7 +7687,7 @@
           <w:rFonts w:ascii="Consolas" w:hAnsi="Consolas"/>
           <w:sz w:val="22"/>
         </w:rPr>
-        <w:t>candidate\_zone</w:t>
+        <w:t>candidate_zone</w:t>
       </w:r>
       <w:r>
         <w:t xml:space="preserve"> và </w:t>
@@ -9331,7 +7697,7 @@
           <w:rFonts w:ascii="Consolas" w:hAnsi="Consolas"/>
           <w:sz w:val="22"/>
         </w:rPr>
-        <w:t>candidate\_count</w:t>
+        <w:t>candidate_count</w:t>
       </w:r>
       <w:r>
         <w:t>.</w:t>
@@ -9349,7 +7715,7 @@
           <w:rFonts w:ascii="Consolas" w:hAnsi="Consolas"/>
           <w:sz w:val="22"/>
         </w:rPr>
-        <w:t>candidate\_count += 1</w:t>
+        <w:t>candidate_count += 1</w:t>
       </w:r>
       <w:r>
         <w:t>.</w:t>
@@ -9367,7 +7733,7 @@
           <w:rFonts w:ascii="Consolas" w:hAnsi="Consolas"/>
           <w:sz w:val="22"/>
         </w:rPr>
-        <w:t>candidate\_count -= 1</w:t>
+        <w:t>candidate_count -= 1</w:t>
       </w:r>
       <w:r>
         <w:t xml:space="preserve"> (không reset về 0 — “leaky”).</w:t>
@@ -9385,7 +7751,7 @@
           <w:rFonts w:ascii="Consolas" w:hAnsi="Consolas"/>
           <w:sz w:val="22"/>
         </w:rPr>
-        <w:t>candidate\_count</w:t>
+        <w:t>candidate_count</w:t>
       </w:r>
       <w:r>
         <w:t xml:space="preserve"> </w:t>
@@ -9410,7 +7776,7 @@
           <w:rFonts w:ascii="Consolas" w:hAnsi="Consolas"/>
           <w:sz w:val="22"/>
         </w:rPr>
-        <w:t>DEBOUNCE\_COUNT</w:t>
+        <w:t>DEBOUNCE_COUNT</w:t>
       </w:r>
       <w:r>
         <w:t xml:space="preserve"> (mặc định 2).</w:t>
@@ -9430,7 +7796,7 @@
           <w:rFonts w:ascii="Consolas" w:hAnsi="Consolas"/>
           <w:sz w:val="22"/>
         </w:rPr>
-        <w:t>DEBOUNCE\_COUNT = 2</w:t>
+        <w:t>DEBOUNCE_COUNT = 2</w:t>
       </w:r>
       <w:r>
         <w:t xml:space="preserve"> và báo cáo  1 Hz, trễ chuyển zone  2 s, chấp nhận được cho theo dõi người.</w:t>
@@ -9826,7 +8192,7 @@
           <w:rFonts w:ascii="Consolas" w:hAnsi="Consolas"/>
           <w:sz w:val="22"/>
         </w:rPr>
-        <w:t>epoch\_key</w:t>
+        <w:t>epoch_key</w:t>
       </w:r>
       <w:r>
         <w:t xml:space="preserve"> dẫn xuất:</w:t>
@@ -9976,7 +8342,7 @@
           <w:rFonts w:ascii="Consolas" w:hAnsi="Consolas"/>
           <w:sz w:val="22"/>
         </w:rPr>
-        <w:t>epoch\_counter</w:t>
+        <w:t>epoch_counter</w:t>
       </w:r>
       <w:r>
         <w:t xml:space="preserve"> là “giờ kể từ lúc boot”, không phải wall-clock. Scanner không biết Tag boot lúc nào, nên lần đầu nhận gói hợp lệ nó </w:t>
@@ -9995,7 +8361,7 @@
           <w:rFonts w:ascii="Consolas" w:hAnsi="Consolas"/>
           <w:sz w:val="22"/>
         </w:rPr>
-        <w:t>locked\_epoch</w:t>
+        <w:t>locked_epoch</w:t>
       </w:r>
       <w:r>
         <w:t>) và sau đó chỉ chấp nhận cửa sổ hẹp quanh giá trị này.</w:t>
@@ -10057,7 +8423,7 @@
           <w:rFonts w:ascii="Consolas" w:hAnsi="Consolas"/>
           <w:sz w:val="22"/>
         </w:rPr>
-        <w:t>master\_key</w:t>
+        <w:t>master_key</w:t>
       </w:r>
       <w:r>
         <w:t xml:space="preserve"> thì không tính được epoch_key mới.</w:t>
@@ -10098,7 +8464,7 @@
           <w:rFonts w:ascii="Consolas" w:hAnsi="Consolas"/>
           <w:sz w:val="22"/>
         </w:rPr>
-        <w:t>esp\_fill\_random()</w:t>
+        <w:t>esp_fill_random()</w:t>
       </w:r>
       <w:r>
         <w:t>.</w:t>
@@ -10132,7 +8498,7 @@
           <w:rFonts w:ascii="Consolas" w:hAnsi="Consolas"/>
           <w:sz w:val="22"/>
         </w:rPr>
-        <w:t>OTA\_KEY\_PUSH</w:t>
+        <w:t>OTA_KEY_PUSH</w:t>
       </w:r>
       <w:r>
         <w:t xml:space="preserve"> (đã mã hoá bởi AppKey mesh).</w:t>
@@ -10240,7 +8606,7 @@
           <w:rFonts w:ascii="Consolas" w:hAnsi="Consolas"/>
           <w:sz w:val="22"/>
         </w:rPr>
-        <w:t>ota\_0</w:t>
+        <w:t>ota_0</w:t>
       </w:r>
       <w:r>
         <w:t xml:space="preserve"> và </w:t>
@@ -10250,7 +8616,7 @@
           <w:rFonts w:ascii="Consolas" w:hAnsi="Consolas"/>
           <w:sz w:val="22"/>
         </w:rPr>
-        <w:t>ota\_1</w:t>
+        <w:t>ota_1</w:t>
       </w:r>
       <w:r>
         <w:t xml:space="preserve">, mỗi slot chứa một firmware image. Bootloader chọn slot nào chạy dựa trên bảng </w:t>
@@ -10260,7 +8626,7 @@
           <w:rFonts w:ascii="Consolas" w:hAnsi="Consolas"/>
           <w:sz w:val="22"/>
         </w:rPr>
-        <w:t>ota\_data</w:t>
+        <w:t>ota_data</w:t>
       </w:r>
       <w:r>
         <w:t>. Khi OTA:</w:t>
@@ -10348,7 +8714,7 @@
           <w:rFonts w:ascii="Consolas" w:hAnsi="Consolas"/>
           <w:sz w:val="22"/>
         </w:rPr>
-        <w:t>ota\_data</w:t>
+        <w:t>ota_data</w:t>
       </w:r>
       <w:r>
         <w:t xml:space="preserve"> để boot sau chạy slot </w:t>
@@ -10458,7 +8824,7 @@
           <w:rFonts w:ascii="Consolas" w:hAnsi="Consolas"/>
           <w:sz w:val="22"/>
         </w:rPr>
-        <w:t>esp\_app\_get\_description()</w:t>
+        <w:t>esp_app_get_description()</w:t>
       </w:r>
       <w:r>
         <w:t>) thì bỏ qua. Tránh flash lại chính image hiện tại.</w:t>
@@ -10482,7 +8848,7 @@
           <w:rFonts w:ascii="Consolas" w:hAnsi="Consolas"/>
           <w:sz w:val="22"/>
         </w:rPr>
-        <w:t>PROJECT\_VER</w:t>
+        <w:t>PROJECT_VER</w:t>
       </w:r>
       <w:r>
         <w:t xml:space="preserve"> định dạng </w:t>
@@ -10592,7 +8958,7 @@
           <w:rFonts w:ascii="Consolas" w:hAnsi="Consolas"/>
           <w:sz w:val="22"/>
         </w:rPr>
-        <w:t>OTA\_TRIGGER</w:t>
+        <w:t>OTA_TRIGGER</w:t>
       </w:r>
       <w:r>
         <w:t xml:space="preserve"> 5 lần cách nhau 500 ms để đảm bảo nhận.</w:t>
@@ -10612,7 +8978,7 @@
           <w:rFonts w:ascii="Consolas" w:hAnsi="Consolas"/>
           <w:sz w:val="22"/>
         </w:rPr>
-        <w:t>report\_pending\_task</w:t>
+        <w:t>report_pending_task</w:t>
       </w:r>
       <w:r>
         <w:t xml:space="preserve"> phát hiện cờ pending trong NVS và gửi </w:t>
@@ -10622,7 +8988,7 @@
           <w:rFonts w:ascii="Consolas" w:hAnsi="Consolas"/>
           <w:sz w:val="22"/>
         </w:rPr>
-        <w:t>OTA\_RESULT (status=0)</w:t>
+        <w:t>OTA_RESULT (status=0)</w:t>
       </w:r>
       <w:r>
         <w:t xml:space="preserve"> về Gateway.</w:t>
@@ -10650,7 +9016,7 @@
           <w:rFonts w:ascii="Consolas" w:hAnsi="Consolas"/>
           <w:sz w:val="22"/>
         </w:rPr>
-        <w:t>auto\_check\_task</w:t>
+        <w:t>auto_check_task</w:t>
       </w:r>
       <w:r>
         <w:t xml:space="preserve"> gọi </w:t>
@@ -10660,7 +9026,7 @@
           <w:rFonts w:ascii="Consolas" w:hAnsi="Consolas"/>
           <w:sz w:val="22"/>
         </w:rPr>
-        <w:t>bmt\_ota\_trigger()</w:t>
+        <w:t>bmt_ota_trigger()</w:t>
       </w:r>
       <w:r>
         <w:t xml:space="preserve"> mỗi 3 phút. Nhờ SHA256 skip, các lần trigger không có firmware mới kết thúc nhanh (chỉ tải header, so SHA256, huỷ). Nhờ đó mọi node đều lên bản mới không cần điều phối trung tâm.</w:t>
@@ -10984,7 +9350,7 @@
           <w:rFonts w:ascii="Consolas" w:hAnsi="Consolas"/>
           <w:sz w:val="22"/>
         </w:rPr>
-        <w:t>esp\_https\_ota</w:t>
+        <w:t>esp_https_ota</w:t>
       </w:r>
       <w:r>
         <w:t xml:space="preserve"> dùng chunked để tải firmware.</w:t>
@@ -11036,7 +9402,7 @@
           <w:rFonts w:ascii="Consolas" w:hAnsi="Consolas"/>
           <w:sz w:val="22"/>
         </w:rPr>
-        <w:t>BMT\_WIFI\_SSID</w:t>
+        <w:t>BMT_WIFI_SSID</w:t>
       </w:r>
       <w:r>
         <w:t xml:space="preserve">, </w:t>
@@ -11046,7 +9412,7 @@
           <w:rFonts w:ascii="Consolas" w:hAnsi="Consolas"/>
           <w:sz w:val="22"/>
         </w:rPr>
-        <w:t>BMT\_WIFI\_PASS</w:t>
+        <w:t>BMT_WIFI_PASS</w:t>
       </w:r>
       <w:r>
         <w:t xml:space="preserve">, </w:t>
@@ -11056,7 +9422,7 @@
           <w:rFonts w:ascii="Consolas" w:hAnsi="Consolas"/>
           <w:sz w:val="22"/>
         </w:rPr>
-        <w:t>BMT\_TB\_GATEWAY\_TOKEN</w:t>
+        <w:t>BMT_TB_GATEWAY_TOKEN</w:t>
       </w:r>
       <w:r>
         <w:t xml:space="preserve"> nhúng thẳng. Qua HTTP thô, kẻ tấn công trên LAN có thể sniff và lấy credential mà không cần chạm phần cứng. HTTPS bịt lỗ hổng này.</w:t>
@@ -11377,7 +9743,7 @@
           <w:rFonts w:ascii="Consolas" w:hAnsi="Consolas"/>
           <w:sz w:val="22"/>
         </w:rPr>
-        <w:t>apps/gateway/components/bmt\_mqtt/ca.pem</w:t>
+        <w:t>apps/gateway/components/bmt_mqtt/ca.pem</w:t>
       </w:r>
       <w:r>
         <w:t>: cho MQTTS client.</w:t>
@@ -11392,7 +9758,7 @@
           <w:rFonts w:ascii="Consolas" w:hAnsi="Consolas"/>
           <w:sz w:val="22"/>
         </w:rPr>
-        <w:t>components/bmt\_ota/ota\_ca.pem</w:t>
+        <w:t>components/bmt_ota/ota_ca.pem</w:t>
       </w:r>
       <w:r>
         <w:t>: cho HTTPS OTA client (dùng ở cả 4 firmware).</w:t>
@@ -11485,7 +9851,7 @@
           <w:rFonts w:ascii="Consolas" w:hAnsi="Consolas"/>
           <w:sz w:val="22"/>
         </w:rPr>
-        <w:t>ble\_tag</w:t>
+        <w:t>ble_tag</w:t>
       </w:r>
       <w:r>
         <w:t xml:space="preserve"> cho Tag, </w:t>
@@ -11495,7 +9861,7 @@
           <w:rFonts w:ascii="Consolas" w:hAnsi="Consolas"/>
           <w:sz w:val="22"/>
         </w:rPr>
-        <w:t>ble\_mesh\_node</w:t>
+        <w:t>ble_mesh_node</w:t>
       </w:r>
       <w:r>
         <w:t xml:space="preserve"> cho Scanner/Relay.</w:t>
@@ -12207,7 +10573,7 @@
           <w:rFonts w:ascii="Consolas" w:hAnsi="Consolas"/>
           <w:sz w:val="22"/>
         </w:rPr>
-        <w:t>ble\_tag\_zone\_detection</w:t>
+        <w:t>ble_tag_zone_detection</w:t>
       </w:r>
       <w:r>
         <w:t xml:space="preserve"> cho profile </w:t>
@@ -12217,7 +10583,7 @@
           <w:rFonts w:ascii="Consolas" w:hAnsi="Consolas"/>
           <w:sz w:val="22"/>
         </w:rPr>
-        <w:t>ble\_tag</w:t>
+        <w:t>ble_tag</w:t>
       </w:r>
       <w:r>
         <w:t xml:space="preserve"> (chạy hysteresis + debounce đã nêu), và </w:t>
@@ -12227,7 +10593,7 @@
           <w:rFonts w:ascii="Consolas" w:hAnsi="Consolas"/>
           <w:sz w:val="22"/>
         </w:rPr>
-        <w:t>ble\_mesh\_node\_ota</w:t>
+        <w:t>ble_mesh_node_ota</w:t>
       </w:r>
       <w:r>
         <w:t xml:space="preserve"> cho profile </w:t>
@@ -12237,7 +10603,7 @@
           <w:rFonts w:ascii="Consolas" w:hAnsi="Consolas"/>
           <w:sz w:val="22"/>
         </w:rPr>
-        <w:t>ble\_mesh\_node</w:t>
+        <w:t>ble_mesh_node</w:t>
       </w:r>
       <w:r>
         <w:t xml:space="preserve"> (lưu </w:t>
@@ -12247,7 +10613,7 @@
           <w:rFonts w:ascii="Consolas" w:hAnsi="Consolas"/>
           <w:sz w:val="22"/>
         </w:rPr>
-        <w:t>ota\_result</w:t>
+        <w:t>ota_result</w:t>
       </w:r>
       <w:r>
         <w:t xml:space="preserve"> vào attribute).</w:t>
@@ -12379,7 +10745,7 @@
           <w:rFonts w:ascii="Consolas" w:hAnsi="Consolas"/>
           <w:sz w:val="22"/>
         </w:rPr>
-        <w:t>tag\_id</w:t>
+        <w:t>tag_id</w:t>
       </w:r>
       <w:r>
         <w:t xml:space="preserve">, </w:t>
@@ -12389,7 +10755,7 @@
           <w:rFonts w:ascii="Consolas" w:hAnsi="Consolas"/>
           <w:sz w:val="22"/>
         </w:rPr>
-        <w:t>rssi\_filtered</w:t>
+        <w:t>rssi_filtered</w:t>
       </w:r>
       <w:r>
         <w:t xml:space="preserve">, </w:t>
@@ -12399,7 +10765,7 @@
           <w:rFonts w:ascii="Consolas" w:hAnsi="Consolas"/>
           <w:sz w:val="22"/>
         </w:rPr>
-        <w:t>scanner\_id</w:t>
+        <w:t>scanner_id</w:t>
       </w:r>
       <w:r>
         <w:t xml:space="preserve">) lên gateway, gateway đẩy lên ThingsBoard, rule chain trên server áp dụng hysteresis và debounce rồi ghi thuộc tính </w:t>
@@ -12455,7 +10821,7 @@
           <w:rFonts w:ascii="Consolas" w:hAnsi="Consolas"/>
           <w:sz w:val="22"/>
         </w:rPr>
-        <w:t>bmt\_tag\_adv\_payload\_t</w:t>
+        <w:t>bmt_tag_adv_payload_t</w:t>
       </w:r>
       <w:r>
         <w:t xml:space="preserve"> có tổng </w:t>
@@ -12817,7 +11183,7 @@
           <w:rFonts w:ascii="Consolas" w:hAnsi="Consolas"/>
           <w:sz w:val="22"/>
         </w:rPr>
-        <w:t>HKDF(master\_key, epoch)</w:t>
+        <w:t>HKDF(master_key, epoch)</w:t>
       </w:r>
       <w:r>
         <w:t xml:space="preserve"> với </w:t>
@@ -12827,7 +11193,7 @@
           <w:rFonts w:ascii="Consolas" w:hAnsi="Consolas"/>
           <w:sz w:val="22"/>
         </w:rPr>
-        <w:t>epoch = time\_ms / 3600000</w:t>
+        <w:t>epoch = time_ms / 3600000</w:t>
       </w:r>
       <w:r>
         <w:t>. Scanner làm y hệt với cùng master key. Cơ chế này giống TOTP: hai bên không cần trao đổi mà vẫn có cùng khoá tại cùng thời điểm, và nếu ai đó ghi lại được stream ADV cũ thì cũng không tái sử dụng được sang giờ khác.</w:t>
@@ -12965,7 +11331,7 @@
           <w:rFonts w:ascii="Consolas" w:hAnsi="Consolas"/>
           <w:sz w:val="22"/>
         </w:rPr>
-        <w:t>scan\_interval</w:t>
+        <w:t>scan_interval</w:t>
       </w:r>
       <w:r>
         <w:t xml:space="preserve"> 50 ms (0x0050 BLE units), </w:t>
@@ -12975,7 +11341,7 @@
           <w:rFonts w:ascii="Consolas" w:hAnsi="Consolas"/>
           <w:sz w:val="22"/>
         </w:rPr>
-        <w:t>scan\_window</w:t>
+        <w:t>scan_window</w:t>
       </w:r>
       <w:r>
         <w:t xml:space="preserve"> 30 ms (0x0030 BLE units), tức 60% thời gian mở radio để nghe ADV, 40% dành cho các hoạt động mesh (publish, receive, relay nếu enable). Duty cycle 60% đủ cao để bắt gần hết beacon 500 ms từ tag nhưng vẫn dư băng thông cho mesh mà không bị nghẽn.</w:t>
@@ -13003,7 +11369,7 @@
           <w:rFonts w:ascii="Consolas" w:hAnsi="Consolas"/>
           <w:sz w:val="22"/>
         </w:rPr>
-        <w:t>BMT\_MAX\_TAGS = 20</w:t>
+        <w:t>BMT_MAX_TAGS = 20</w:t>
       </w:r>
       <w:r>
         <w:t xml:space="preserve"> entry. Mỗi entry chứa UUID, </w:t>
@@ -13013,7 +11379,7 @@
           <w:rFonts w:ascii="Consolas" w:hAnsi="Consolas"/>
           <w:sz w:val="22"/>
         </w:rPr>
-        <w:t>last\_seq</w:t>
+        <w:t>last_seq</w:t>
       </w:r>
       <w:r>
         <w:t xml:space="preserve">, </w:t>
@@ -13023,7 +11389,7 @@
           <w:rFonts w:ascii="Consolas" w:hAnsi="Consolas"/>
           <w:sz w:val="22"/>
         </w:rPr>
-        <w:t>last\_rssi\_raw</w:t>
+        <w:t>last_rssi_raw</w:t>
       </w:r>
       <w:r>
         <w:t>, trạng thái Kalman (</w:t>
@@ -13043,7 +11409,7 @@
           <w:rFonts w:ascii="Consolas" w:hAnsi="Consolas"/>
           <w:sz w:val="22"/>
         </w:rPr>
-        <w:t>error\_cov</w:t>
+        <w:t>error_cov</w:t>
       </w:r>
       <w:r>
         <w:t xml:space="preserve">) và </w:t>
@@ -13053,7 +11419,7 @@
           <w:rFonts w:ascii="Consolas" w:hAnsi="Consolas"/>
           <w:sz w:val="22"/>
         </w:rPr>
-        <w:t>last\_seen\_ms</w:t>
+        <w:t>last_seen_ms</w:t>
       </w:r>
       <w:r>
         <w:t xml:space="preserve">. Lần đầu thấy một UUID mới, Kalman được khởi tạo bằng RSSI hiện tại và </w:t>
@@ -13063,7 +11429,7 @@
           <w:rFonts w:ascii="Consolas" w:hAnsi="Consolas"/>
           <w:sz w:val="22"/>
         </w:rPr>
-        <w:t>error\_cov = 1.0</w:t>
+        <w:t>error_cov = 1.0</w:t>
       </w:r>
       <w:r>
         <w:t xml:space="preserve">. Các lần sau, update theo công thức Kalman 1D với </w:t>
@@ -13159,7 +11525,7 @@
           <w:rFonts w:ascii="Consolas" w:hAnsi="Consolas"/>
           <w:sz w:val="22"/>
         </w:rPr>
-        <w:t>last\_seq</w:t>
+        <w:t>last_seq</w:t>
       </w:r>
       <w:r>
         <w:t xml:space="preserve"> trong bảng:</w:t>
@@ -13236,7 +11602,7 @@
           <w:rFonts w:ascii="Consolas" w:hAnsi="Consolas"/>
           <w:sz w:val="22"/>
         </w:rPr>
-        <w:t>replay\_reject</w:t>
+        <w:t>replay_reject</w:t>
       </w:r>
       <w:r>
         <w:t>.</w:t>
@@ -13326,7 +11692,7 @@
           <w:rFonts w:ascii="Consolas" w:hAnsi="Consolas"/>
           <w:sz w:val="22"/>
         </w:rPr>
-        <w:t>TAG\_STATUS</w:t>
+        <w:t>TAG_STATUS</w:t>
       </w:r>
       <w:r>
         <w:t xml:space="preserve"> (vendor model 0x02E5/0x0000) tới địa chỉ unicast của Gateway (mặc định 0x0001). Payload chỉ chứa UUID và RSSI đã lọc; không kèm quyết định phòng. TTL đặt = 7 để cho phép qua tối đa 7 hop; trong thực tế mesh chỉ 1–2 hop nên TTL dư này chỉ dùng khi topology chưa ổn định lúc bring-up.</w:t>
@@ -13372,7 +11738,7 @@
           <w:rFonts w:ascii="Consolas" w:hAnsi="Consolas"/>
           <w:sz w:val="22"/>
         </w:rPr>
-        <w:t>esp\_ble\_mesh\_set\_relay(true)</w:t>
+        <w:t>esp_ble_mesh_set_relay(true)</w:t>
       </w:r>
       <w:r>
         <w:t>. Ở lớp mạng, node này nhận mọi gói mesh, giảm TTL đi 1, và forward lại nếu TTL còn &gt; 0 và gói chưa qua node này (kiểm tra qua network cache). Đây là hành vi mặc định của BLE Mesh, không cần code ứng dụng.</w:t>
@@ -13400,7 +11766,7 @@
           <w:rFonts w:ascii="Consolas" w:hAnsi="Consolas"/>
           <w:sz w:val="22"/>
         </w:rPr>
-        <w:t>RESET\_CMD</w:t>
+        <w:t>RESET_CMD</w:t>
       </w:r>
       <w:r>
         <w:t xml:space="preserve"> (Gateway phát khi watchdog fire, yêu cầu relay wipe NVS và tự re-provision) và </w:t>
@@ -13410,7 +11776,7 @@
           <w:rFonts w:ascii="Consolas" w:hAnsi="Consolas"/>
           <w:sz w:val="22"/>
         </w:rPr>
-        <w:t>OTA\_TRIGGER</w:t>
+        <w:t>OTA_TRIGGER</w:t>
       </w:r>
       <w:r>
         <w:t xml:space="preserve"> (Gateway phát khi có firmware mới trên server). Không bind AppKey, hai opcode này không lên tới access layer của Relay và cơ chế tự phục hồi lẫn OTA đều mất tác dụng.</w:t>
@@ -13566,7 +11932,7 @@
           <w:rFonts w:ascii="Consolas" w:hAnsi="Consolas"/>
           <w:sz w:val="22"/>
         </w:rPr>
-        <w:t>node.config\_done = true</w:t>
+        <w:t>node.config_done = true</w:t>
       </w:r>
       <w:r>
         <w:t xml:space="preserve"> sau khi nhận đủ 2 ACK từ node, không set trước để tránh race condition khi tag đầu tiên xuất hiện mà node chưa sẵn sàng nhận vendor message.</w:t>
@@ -13594,7 +11960,7 @@
           <w:rFonts w:ascii="Consolas" w:hAnsi="Consolas"/>
           <w:sz w:val="22"/>
         </w:rPr>
-        <w:t>bmt\_node\_t nodes[BMT\_MAX\_NODES]</w:t>
+        <w:t>bmt_node_t nodes[BMT_MAX_NODES]</w:t>
       </w:r>
       <w:r>
         <w:t xml:space="preserve"> với các trường: địa chỉ mesh, UUID gốc, kiểu (SCAN/RELAY), </w:t>
@@ -13604,7 +11970,7 @@
           <w:rFonts w:ascii="Consolas" w:hAnsi="Consolas"/>
           <w:sz w:val="22"/>
         </w:rPr>
-        <w:t>config\_done</w:t>
+        <w:t>config_done</w:t>
       </w:r>
       <w:r>
         <w:t xml:space="preserve">, </w:t>
@@ -13614,7 +11980,7 @@
           <w:rFonts w:ascii="Consolas" w:hAnsi="Consolas"/>
           <w:sz w:val="22"/>
         </w:rPr>
-        <w:t>last\_seen\_ms</w:t>
+        <w:t>last_seen_ms</w:t>
       </w:r>
       <w:r>
         <w:t xml:space="preserve">. Sau mỗi lần provision hoặc drop node, mảng được persist vào NVS qua </w:t>
@@ -13624,7 +11990,7 @@
           <w:rFonts w:ascii="Consolas" w:hAnsi="Consolas"/>
           <w:sz w:val="22"/>
         </w:rPr>
-        <w:t>nvs\_set\_blob</w:t>
+        <w:t>nvs_set_blob</w:t>
       </w:r>
       <w:r>
         <w:t xml:space="preserve">. Khi khởi động lại, gateway load blob bằng </w:t>
@@ -13634,7 +12000,7 @@
           <w:rFonts w:ascii="Consolas" w:hAnsi="Consolas"/>
           <w:sz w:val="22"/>
         </w:rPr>
-        <w:t>nvs\_get\_blob</w:t>
+        <w:t>nvs_get_blob</w:t>
       </w:r>
       <w:r>
         <w:t xml:space="preserve"> và khôi phục state mesh không cần re-provision. Nhờ vậy, sau mất điện gateway boot lại là biết ngay các scanner đang ở địa chỉ nào.</w:t>
@@ -13670,7 +12036,7 @@
           <w:rFonts w:ascii="Consolas" w:hAnsi="Consolas"/>
           <w:sz w:val="22"/>
         </w:rPr>
-        <w:t>TAG\_STATUS</w:t>
+        <w:t>TAG_STATUS</w:t>
       </w:r>
       <w:r>
         <w:t xml:space="preserve">, parse thành </w:t>
@@ -13680,7 +12046,7 @@
           <w:rFonts w:ascii="Consolas" w:hAnsi="Consolas"/>
           <w:sz w:val="22"/>
         </w:rPr>
-        <w:t>tag\_report\_t</w:t>
+        <w:t>tag_report_t</w:t>
       </w:r>
       <w:r>
         <w:t xml:space="preserve">, đẩy vào </w:t>
@@ -13690,7 +12056,7 @@
           <w:rFonts w:ascii="Consolas" w:hAnsi="Consolas"/>
           <w:sz w:val="22"/>
         </w:rPr>
-        <w:t>QueueHandle\_t xTagReportQueue</w:t>
+        <w:t>QueueHandle_t xTagReportQueue</w:t>
       </w:r>
       <w:r>
         <w:t xml:space="preserve"> (64 slot). Không đụng MQTT.</w:t>
@@ -13728,7 +12094,7 @@
           <w:rFonts w:ascii="Consolas" w:hAnsi="Consolas"/>
           <w:sz w:val="22"/>
         </w:rPr>
-        <w:t>esp\_mqtt\_client</w:t>
+        <w:t>esp_mqtt_client</w:t>
       </w:r>
       <w:r>
         <w:t xml:space="preserve">. Nếu queue đầy, report cũ bị drop và tăng counter </w:t>
@@ -13738,7 +12104,7 @@
           <w:rFonts w:ascii="Consolas" w:hAnsi="Consolas"/>
           <w:sz w:val="22"/>
         </w:rPr>
-        <w:t>report\_dropped</w:t>
+        <w:t>report_dropped</w:t>
       </w:r>
       <w:r>
         <w:t>.</w:t>
@@ -13821,7 +12187,7 @@
           <w:rFonts w:ascii="Consolas" w:hAnsi="Consolas"/>
           <w:sz w:val="22"/>
         </w:rPr>
-        <w:t>TAG\_STATUS</w:t>
+        <w:t>TAG_STATUS</w:t>
       </w:r>
       <w:r>
         <w:t xml:space="preserve"> nhận được. Cơ chế:</w:t>
@@ -13847,7 +12213,7 @@
           <w:rFonts w:ascii="Consolas" w:hAnsi="Consolas"/>
           <w:sz w:val="22"/>
         </w:rPr>
-        <w:t>config\_done</w:t>
+        <w:t>config_done</w:t>
       </w:r>
       <w:r>
         <w:t>, watchdog fire.</w:t>
@@ -13865,7 +12231,7 @@
           <w:rFonts w:ascii="Consolas" w:hAnsi="Consolas"/>
           <w:sz w:val="22"/>
         </w:rPr>
-        <w:t>RESET\_CMD</w:t>
+        <w:t>RESET_CMD</w:t>
       </w:r>
       <w:r>
         <w:t xml:space="preserve"> 5 lần cách 500 ms tới địa chỉ all-nodes </w:t>
@@ -13885,7 +12251,7 @@
           <w:rFonts w:ascii="Consolas" w:hAnsi="Consolas"/>
           <w:sz w:val="22"/>
         </w:rPr>
-        <w:t>send\_ok</w:t>
+        <w:t>send_ok</w:t>
       </w:r>
       <w:r>
         <w:t>.</w:t>
@@ -13903,7 +12269,7 @@
           <w:rFonts w:ascii="Consolas" w:hAnsi="Consolas"/>
           <w:sz w:val="22"/>
         </w:rPr>
-        <w:t>send\_ok</w:t>
+        <w:t>send_ok</w:t>
       </w:r>
       <w:r>
         <w:t xml:space="preserve">, gateway tự </w:t>
@@ -13913,7 +12279,7 @@
           <w:rFonts w:ascii="Consolas" w:hAnsi="Consolas"/>
           <w:sz w:val="22"/>
         </w:rPr>
-        <w:t>nvs\_erase\_all</w:t>
+        <w:t>nvs_erase_all</w:t>
       </w:r>
       <w:r>
         <w:t xml:space="preserve"> phân vùng </w:t>
@@ -13923,7 +12289,7 @@
           <w:rFonts w:ascii="Consolas" w:hAnsi="Consolas"/>
           <w:sz w:val="22"/>
         </w:rPr>
-        <w:t>ble\_mesh</w:t>
+        <w:t>ble_mesh</w:t>
       </w:r>
       <w:r>
         <w:t>, xoá node table và reset. Cả mesh re-provision từ đầu.</w:t>
@@ -13942,7 +12308,7 @@
         <w:rPr>
           <w:b/>
         </w:rPr>
-        <w:t>ít nhất 1 lần send\_ok</w:t>
+        <w:t>ít nhất 1 lần send_ok</w:t>
       </w:r>
       <w:r>
         <w:t xml:space="preserve"> tránh gateway wipe mù trong khi mesh đang chết hoàn toàn: nếu không có ai nhận được RESET_CMD (mesh đã sập hết), reset cũng không giúp được gì và có thể khiến tình huống tệ hơn. Ngưỡng "ít nhất 1" đủ để đảm bảo tối thiểu 1 node còn nhận được lệnh — nó sẽ propagate RESET tới các node khác qua broadcast tự nhiên.</w:t>
@@ -13970,7 +12336,7 @@
           <w:rFonts w:ascii="Consolas" w:hAnsi="Consolas"/>
           <w:sz w:val="22"/>
         </w:rPr>
-        <w:t>OTA\_KEY\_UPDATE</w:t>
+        <w:t>OTA_KEY_UPDATE</w:t>
       </w:r>
       <w:r>
         <w:t xml:space="preserve"> tới tất cả scanner. Scanner nhận khoá, </w:t>
@@ -14127,7 +12493,7 @@
           <w:rFonts w:ascii="Consolas" w:hAnsi="Consolas"/>
           <w:sz w:val="22"/>
         </w:rPr>
-        <w:t>ble\_tag</w:t>
+        <w:t>ble_tag</w:t>
       </w:r>
       <w:r>
         <w:t xml:space="preserve">: các Tag di động, telemetry chính là RSSI theo từng scanner, thuộc tính là </w:t>
@@ -14152,7 +12518,7 @@
           <w:rFonts w:ascii="Consolas" w:hAnsi="Consolas"/>
           <w:sz w:val="22"/>
         </w:rPr>
-        <w:t>ble\_mesh\_node</w:t>
+        <w:t>ble_mesh_node</w:t>
       </w:r>
       <w:r>
         <w:t xml:space="preserve">: các Scanner, Relay, Gateway, telemetry là </w:t>
@@ -14172,7 +12538,7 @@
           <w:rFonts w:ascii="Consolas" w:hAnsi="Consolas"/>
           <w:sz w:val="22"/>
         </w:rPr>
-        <w:t>rssi\_avg\_by\_scanner</w:t>
+        <w:t>rssi_avg_by_scanner</w:t>
       </w:r>
       <w:r>
         <w:t xml:space="preserve">, </w:t>
@@ -14182,7 +12548,7 @@
           <w:rFonts w:ascii="Consolas" w:hAnsi="Consolas"/>
           <w:sz w:val="22"/>
         </w:rPr>
-        <w:t>ota\_result</w:t>
+        <w:t>ota_result</w:t>
       </w:r>
       <w:r>
         <w:t>.</w:t>
@@ -14234,7 +12600,7 @@
           <w:rFonts w:ascii="Consolas" w:hAnsi="Consolas"/>
           <w:sz w:val="22"/>
         </w:rPr>
-        <w:t>rssi\_scanner\_1..3</w:t>
+        <w:t>rssi_scanner_1..3</w:t>
       </w:r>
       <w:r>
         <w:t xml:space="preserve"> từ payload gateway.</w:t>
@@ -14268,7 +12634,7 @@
           <w:rFonts w:ascii="Consolas" w:hAnsi="Consolas"/>
           <w:sz w:val="22"/>
         </w:rPr>
-        <w:t>last\_scanner</w:t>
+        <w:t>last_scanner</w:t>
       </w:r>
       <w:r>
         <w:t xml:space="preserve">, </w:t>
@@ -14278,7 +12644,7 @@
           <w:rFonts w:ascii="Consolas" w:hAnsi="Consolas"/>
           <w:sz w:val="22"/>
         </w:rPr>
-        <w:t>confirm\_count</w:t>
+        <w:t>confirm_count</w:t>
       </w:r>
       <w:r>
         <w:t xml:space="preserve"> hiện tại của tag.</w:t>
@@ -14302,7 +12668,7 @@
           <w:rFonts w:ascii="Consolas" w:hAnsi="Consolas"/>
           <w:sz w:val="22"/>
         </w:rPr>
-        <w:t>last\_scanner</w:t>
+        <w:t>last_scanner</w:t>
       </w:r>
       <w:r>
         <w:t xml:space="preserve">, kiểm tra chênh lệch RSSI so với </w:t>
@@ -14312,7 +12678,7 @@
           <w:rFonts w:ascii="Consolas" w:hAnsi="Consolas"/>
           <w:sz w:val="22"/>
         </w:rPr>
-        <w:t>last\_scanner</w:t>
+        <w:t>last_scanner</w:t>
       </w:r>
       <w:r>
         <w:t xml:space="preserve"> có </w:t>
@@ -14343,7 +12709,7 @@
           <w:rFonts w:ascii="Consolas" w:hAnsi="Consolas"/>
           <w:sz w:val="22"/>
         </w:rPr>
-        <w:t>last\_scanner</w:t>
+        <w:t>last_scanner</w:t>
       </w:r>
       <w:r>
         <w:t>.</w:t>
@@ -14367,7 +12733,7 @@
           <w:rFonts w:ascii="Consolas" w:hAnsi="Consolas"/>
           <w:sz w:val="22"/>
         </w:rPr>
-        <w:t>confirm\_count</w:t>
+        <w:t>confirm_count</w:t>
       </w:r>
       <w:r>
         <w:t xml:space="preserve">. Nếu </w:t>
@@ -14484,7 +12850,7 @@
           <w:rFonts w:ascii="Consolas" w:hAnsi="Consolas"/>
           <w:sz w:val="22"/>
         </w:rPr>
-        <w:t>ota\_result</w:t>
+        <w:t>ota_result</w:t>
       </w:r>
       <w:r>
         <w:t xml:space="preserve"> = </w:t>
@@ -14504,7 +12870,7 @@
           <w:rFonts w:ascii="Consolas" w:hAnsi="Consolas"/>
           <w:sz w:val="22"/>
         </w:rPr>
-        <w:t>ota\_status</w:t>
+        <w:t>ota_status</w:t>
       </w:r>
       <w:r>
         <w:t xml:space="preserve"> + </w:t>
@@ -14514,7 +12880,7 @@
           <w:rFonts w:ascii="Consolas" w:hAnsi="Consolas"/>
           <w:sz w:val="22"/>
         </w:rPr>
-        <w:t>ota\_timestamp</w:t>
+        <w:t>ota_timestamp</w:t>
       </w:r>
       <w:r>
         <w:t>. Dashboard đọc thuộc tính này hiển thị bảng OTA history.</w:t>
@@ -14636,7 +13002,7 @@
           <w:rFonts w:ascii="Consolas" w:hAnsi="Consolas"/>
           <w:sz w:val="22"/>
         </w:rPr>
-        <w:t>indoor\_tracking.json</w:t>
+        <w:t>indoor_tracking.json</w:t>
       </w:r>
       <w:r>
         <w:t xml:space="preserve"> nằm trong repo để tái nhập nếu server bị reset.</w:t>
@@ -14732,7 +13098,7 @@
           <w:rFonts w:ascii="Consolas" w:hAnsi="Consolas"/>
           <w:sz w:val="22"/>
         </w:rPr>
-        <w:t>tag\_master\_key</w:t>
+        <w:t>tag_master_key</w:t>
       </w:r>
       <w:r>
         <w:t xml:space="preserve"> theo epoch 1 giờ. Đổi theo giờ (TOTP style).</w:t>
@@ -14756,7 +13122,7 @@
           <w:rFonts w:ascii="Consolas" w:hAnsi="Consolas"/>
           <w:sz w:val="22"/>
         </w:rPr>
-        <w:t>ota\_beacon\_key</w:t>
+        <w:t>ota_beacon_key</w:t>
       </w:r>
       <w:r>
         <w:t>, Gateway rotate mỗi 24 giờ và push cho Scanner qua vendor model.</w:t>
@@ -14886,7 +13252,7 @@
           <w:rFonts w:ascii="Consolas" w:hAnsi="Consolas"/>
           <w:sz w:val="22"/>
         </w:rPr>
-        <w:t>tls/gen\_certs.sh</w:t>
+        <w:t>tls/gen_certs.sh</w:t>
       </w:r>
       <w:r>
         <w:t>, sinh ra:</w:t>
@@ -14986,7 +13352,7 @@
           <w:rFonts w:ascii="Consolas" w:hAnsi="Consolas"/>
           <w:sz w:val="22"/>
         </w:rPr>
-        <w:t>EMBED\_TXTFILES</w:t>
+        <w:t>EMBED_TXTFILES</w:t>
       </w:r>
       <w:r>
         <w:t xml:space="preserve"> và verify CN khi handshake, không verify SAN vì firmware không có DNS resolver. Cấu hình này chống được MITM trong LAN mà không cần hạ tầng CA phức tạp.</w:t>
@@ -15130,7 +13496,7 @@
           <w:rFonts w:ascii="Consolas" w:hAnsi="Consolas"/>
           <w:sz w:val="22"/>
         </w:rPr>
-        <w:t>[opcode=OTA\_TRIGGER, url\_index, HMAC-16]</w:t>
+        <w:t>[opcode=OTA_TRIGGER, url_index, HMAC-16]</w:t>
       </w:r>
       <w:r>
         <w:t xml:space="preserve">, ký bằng </w:t>
@@ -15140,7 +13506,7 @@
           <w:rFonts w:ascii="Consolas" w:hAnsi="Consolas"/>
           <w:sz w:val="22"/>
         </w:rPr>
-        <w:t>ota\_beacon\_key</w:t>
+        <w:t>ota_beacon_key</w:t>
       </w:r>
       <w:r>
         <w:t xml:space="preserve"> hiện hành. Scanner đang quét sẽ nhận đồng thời, verify HMAC, nếu OK thì trigger OTA. Ưu điểm: 3 scanner cập nhật song song, tổng thời gian </w:t>
@@ -15183,7 +13549,7 @@
           <w:rFonts w:ascii="Consolas" w:hAnsi="Consolas"/>
           <w:sz w:val="22"/>
         </w:rPr>
-        <w:t>OTA\_TRIGGER</w:t>
+        <w:t>OTA_TRIGGER</w:t>
       </w:r>
       <w:r>
         <w:t xml:space="preserve"> qua vendor mesh unicast tới Relay 5 lần liên tiếp cách nhau 500 ms, ưu tiên độ tin cậy hơn tốc độ. Relay verify HMAC (cùng </w:t>
@@ -15193,7 +13559,7 @@
           <w:rFonts w:ascii="Consolas" w:hAnsi="Consolas"/>
           <w:sz w:val="22"/>
         </w:rPr>
-        <w:t>ota\_beacon\_key</w:t>
+        <w:t>ota_beacon_key</w:t>
       </w:r>
       <w:r>
         <w:t>), bắt đầu HTTPS OTA. Nếu 5 lần đều fail (Relay offline), Gateway sẽ thử lại ở chu kỳ auto-check kế tiếp.</w:t>
@@ -15221,7 +13587,7 @@
           <w:rFonts w:ascii="Consolas" w:hAnsi="Consolas"/>
           <w:sz w:val="22"/>
         </w:rPr>
-        <w:t>esp\_app\_desc</w:t>
+        <w:t>esp_app_desc</w:t>
       </w:r>
       <w:r>
         <w:t xml:space="preserve"> của file trên server, so sánh SHA256 và version với firmware đang chạy. Nếu khác, chạy OTA. Đây là cơ chế fallback: kể cả khi mesh sập hoàn toàn (Gateway watchdog fire, RESET_CMD không tới scanner), scanner vẫn cập nhật được firmware khi có bản mới trên server.</w:t>
@@ -15319,7 +13685,7 @@
           <w:rFonts w:ascii="Consolas" w:hAnsi="Consolas"/>
           <w:sz w:val="22"/>
         </w:rPr>
-        <w:t>cd apps/gateway \&amp;\&amp; idf.py build</w:t>
+        <w:t>cd apps/gateway &amp;&amp; idf.py build</w:t>
       </w:r>
       <w:r>
         <w:t xml:space="preserve"> riêng cho từng project, không phụ thuộc project khác.</w:t>
@@ -15339,7 +13705,7 @@
           <w:rFonts w:ascii="Consolas" w:hAnsi="Consolas"/>
           <w:sz w:val="22"/>
         </w:rPr>
-        <w:t>apps/*/components/bmt\_*/</w:t>
+        <w:t>apps/*/components/bmt_*/</w:t>
       </w:r>
       <w:r>
         <w:t xml:space="preserve">: ví dụ Gateway có </w:t>
@@ -15349,7 +13715,7 @@
           <w:rFonts w:ascii="Consolas" w:hAnsi="Consolas"/>
           <w:sz w:val="22"/>
         </w:rPr>
-        <w:t>bmt\_mesh</w:t>
+        <w:t>bmt_mesh</w:t>
       </w:r>
       <w:r>
         <w:t xml:space="preserve">, </w:t>
@@ -15359,7 +13725,7 @@
           <w:rFonts w:ascii="Consolas" w:hAnsi="Consolas"/>
           <w:sz w:val="22"/>
         </w:rPr>
-        <w:t>bmt\_mqtt</w:t>
+        <w:t>bmt_mqtt</w:t>
       </w:r>
       <w:r>
         <w:t xml:space="preserve">, </w:t>
@@ -15369,7 +13735,7 @@
           <w:rFonts w:ascii="Consolas" w:hAnsi="Consolas"/>
           <w:sz w:val="22"/>
         </w:rPr>
-        <w:t>bmt\_uart</w:t>
+        <w:t>bmt_uart</w:t>
       </w:r>
       <w:r>
         <w:t xml:space="preserve">, </w:t>
@@ -15379,7 +13745,7 @@
           <w:rFonts w:ascii="Consolas" w:hAnsi="Consolas"/>
           <w:sz w:val="22"/>
         </w:rPr>
-        <w:t>bmt\_watchdog</w:t>
+        <w:t>bmt_watchdog</w:t>
       </w:r>
       <w:r>
         <w:t xml:space="preserve">, </w:t>
@@ -15389,7 +13755,7 @@
           <w:rFonts w:ascii="Consolas" w:hAnsi="Consolas"/>
           <w:sz w:val="22"/>
         </w:rPr>
-        <w:t>bmt\_scan\_list</w:t>
+        <w:t>bmt_scan_list</w:t>
       </w:r>
       <w:r>
         <w:t xml:space="preserve">, </w:t>
@@ -15399,7 +13765,7 @@
           <w:rFonts w:ascii="Consolas" w:hAnsi="Consolas"/>
           <w:sz w:val="22"/>
         </w:rPr>
-        <w:t>bmt\_mac\_cache</w:t>
+        <w:t>bmt_mac_cache</w:t>
       </w:r>
       <w:r>
         <w:t xml:space="preserve">, </w:t>
@@ -15409,7 +13775,7 @@
           <w:rFonts w:ascii="Consolas" w:hAnsi="Consolas"/>
           <w:sz w:val="22"/>
         </w:rPr>
-        <w:t>bmt\_config</w:t>
+        <w:t>bmt_config</w:t>
       </w:r>
       <w:r>
         <w:t xml:space="preserve">. Mỗi component có </w:t>
@@ -15482,7 +13848,7 @@
           <w:rFonts w:ascii="Consolas" w:hAnsi="Consolas"/>
           <w:sz w:val="22"/>
         </w:rPr>
-        <w:t>components/bmt\_ota/</w:t>
+        <w:t>components/bmt_ota/</w:t>
       </w:r>
       <w:r>
         <w:t xml:space="preserve"> ở gốc repo. Mỗi project khai báo </w:t>
@@ -15492,7 +13858,7 @@
           <w:rFonts w:ascii="Consolas" w:hAnsi="Consolas"/>
           <w:sz w:val="22"/>
         </w:rPr>
-        <w:t>list(APPEND EXTRA\_COMPONENT\_DIRS ../../components)</w:t>
+        <w:t>list(APPEND EXTRA_COMPONENT_DIRS ../../components)</w:t>
       </w:r>
       <w:r>
         <w:t xml:space="preserve"> trong </w:t>
@@ -15522,7 +13888,7 @@
           <w:rFonts w:ascii="Consolas" w:hAnsi="Consolas"/>
           <w:sz w:val="22"/>
         </w:rPr>
-        <w:t>ota\_ca.pem</w:t>
+        <w:t>ota_ca.pem</w:t>
       </w:r>
       <w:r>
         <w:t xml:space="preserve">) được nhúng ngay trong component qua </w:t>
@@ -15532,7 +13898,7 @@
           <w:rFonts w:ascii="Consolas" w:hAnsi="Consolas"/>
           <w:sz w:val="22"/>
         </w:rPr>
-        <w:t>EMBED\_TXTFILES</w:t>
+        <w:t>EMBED_TXTFILES</w:t>
       </w:r>
       <w:r>
         <w:t>, tránh phải copy cert vào từng project.</w:t>
@@ -16190,7 +14556,7 @@
           <w:rFonts w:ascii="Consolas" w:hAnsi="Consolas"/>
           <w:sz w:val="22"/>
         </w:rPr>
-        <w:t>scan\_interval</w:t>
+        <w:t>scan_interval</w:t>
       </w:r>
       <w:r>
         <w:t xml:space="preserve"> 100 ms, </w:t>
@@ -16200,7 +14566,7 @@
           <w:rFonts w:ascii="Consolas" w:hAnsi="Consolas"/>
           <w:sz w:val="22"/>
         </w:rPr>
-        <w:t>scan\_window</w:t>
+        <w:t>scan_window</w:t>
       </w:r>
       <w:r>
         <w:t xml:space="preserve"> 80 ms.</w:t>
@@ -16428,7 +14794,7 @@
                 <w:rFonts w:ascii="Consolas" w:hAnsi="Consolas"/>
                 <w:sz w:val="22"/>
               </w:rPr>
-              <w:t>APP\_KEY\_ADD</w:t>
+              <w:t>APP_KEY_ADD</w:t>
             </w:r>
             <w:r>
               <w:t xml:space="preserve"> + </w:t>
@@ -16438,7 +14804,7 @@
                 <w:rFonts w:ascii="Consolas" w:hAnsi="Consolas"/>
                 <w:sz w:val="22"/>
               </w:rPr>
-              <w:t>MODEL\_APP\_BIND</w:t>
+              <w:t>MODEL_APP_BIND</w:t>
             </w:r>
           </w:p>
         </w:tc>
@@ -16831,7 +15197,7 @@
         <w:rPr>
           <w:b/>
         </w:rPr>
-        <w:t>96.9\%</w:t>
+        <w:t>96.9%</w:t>
       </w:r>
       <w:r>
         <w:t>. Các trường hợp sai chủ yếu xảy ra khi tag đứng gần biên giữa hai phòng và trùng thời điểm scanner phòng bên kia có RSSI đột biến mạnh do multipath.</w:t>
@@ -17098,7 +15464,7 @@
         <w:rPr>
           <w:b/>
         </w:rPr>
-        <w:t>8.7~s</w:t>
+        <w:t>8.7 s</w:t>
       </w:r>
       <w:r>
         <w:t>. Gateway load node table từ NVS, kết nối lại WiFi + MQTTS, mesh không cần re-provision. Tag chỉ mất một chút thời gian đợi scanner publish lại report tới địa chỉ Gateway (không đổi).</w:t>
@@ -17125,7 +15491,7 @@
         <w:rPr>
           <w:b/>
         </w:rPr>
-        <w:t>12.4~s</w:t>
+        <w:t>12.4 s</w:t>
       </w:r>
       <w:r>
         <w:t>.</w:t>
@@ -17153,7 +15519,7 @@
           <w:rFonts w:ascii="Consolas" w:hAnsi="Consolas"/>
           <w:sz w:val="22"/>
         </w:rPr>
-        <w:t>TAG\_STATUS</w:t>
+        <w:t>TAG_STATUS</w:t>
       </w:r>
       <w:r>
         <w:t xml:space="preserve"> nào tới Gateway, watchdog fire, broadcast </w:t>
@@ -17163,7 +15529,7 @@
           <w:rFonts w:ascii="Consolas" w:hAnsi="Consolas"/>
           <w:sz w:val="22"/>
         </w:rPr>
-        <w:t>RESET\_CMD</w:t>
+        <w:t>RESET_CMD</w:t>
       </w:r>
       <w:r>
         <w:t xml:space="preserve">. Cấp lại nguồn Relay, cả mesh re-provision từ đầu. Thời gian tự phục hồi trung bình: </w:t>
@@ -17172,7 +15538,7 @@
         <w:rPr>
           <w:b/>
         </w:rPr>
-        <w:t>38.2~s</w:t>
+        <w:t>38.2 s</w:t>
       </w:r>
       <w:r>
         <w:t xml:space="preserve"> (bao gồm 30 s watchdog + 8 s re-provision).</w:t>
@@ -17208,7 +15574,7 @@
           <w:rFonts w:ascii="Consolas" w:hAnsi="Consolas"/>
           <w:sz w:val="22"/>
         </w:rPr>
-        <w:t>ota\_result = success</w:t>
+        <w:t>ota_result = success</w:t>
       </w:r>
       <w:r>
         <w:t>. Kích thước file firmware trung bình 1.1 MB.</w:t>
@@ -17416,7 +15782,7 @@
           <w:rFonts w:ascii="Consolas" w:hAnsi="Consolas"/>
           <w:sz w:val="22"/>
         </w:rPr>
-        <w:t>ota\_result = skip</w:t>
+        <w:t>ota_result = skip</w:t>
       </w:r>
       <w:r>
         <w:t xml:space="preserve">. Thời gian trung bình: </w:t>
@@ -17425,7 +15791,7 @@
         <w:rPr>
           <w:b/>
         </w:rPr>
-        <w:t>0.8~s</w:t>
+        <w:t>0.8 s</w:t>
       </w:r>
       <w:r>
         <w:t>. Cơ chế này tránh reflash không cần thiết khi timer auto-check trigger.</w:t>
@@ -17519,7 +15885,7 @@
           <w:rFonts w:ascii="Consolas" w:hAnsi="Consolas"/>
           <w:sz w:val="22"/>
         </w:rPr>
-        <w:t>ota\_result = fail</w:t>
+        <w:t>ota_result = fail</w:t>
       </w:r>
       <w:r>
         <w:t>, dashboard hiển thị fail. Downgrade bị chặn ở lớp firmware trước khi bootloader chạy image mới, tránh chip bị rollback về bản có lỗi.</w:t>
@@ -17561,7 +15927,7 @@
           <w:rFonts w:ascii="Consolas" w:hAnsi="Consolas"/>
           <w:sz w:val="22"/>
         </w:rPr>
-        <w:t>ota\_result = fail</w:t>
+        <w:t>ota_result = fail</w:t>
       </w:r>
       <w:r>
         <w:t>, giữ nguyên phân vùng đang chạy. Không có downtime.</w:t>
@@ -17599,7 +15965,7 @@
           <w:rFonts w:ascii="Consolas" w:hAnsi="Consolas"/>
           <w:sz w:val="22"/>
         </w:rPr>
-        <w:t>OTA\_TRIGGER</w:t>
+        <w:t>OTA_TRIGGER</w:t>
       </w:r>
       <w:r>
         <w:t xml:space="preserve"> liên tiếp cách nhau 100 ms. Lệnh thứ 2 bị chặn bởi atomic compare-and-swap </w:t>
@@ -17609,7 +15975,7 @@
           <w:rFonts w:ascii="Consolas" w:hAnsi="Consolas"/>
           <w:sz w:val="22"/>
         </w:rPr>
-        <w:t>s\_ota\_in\_progress</w:t>
+        <w:t>s_ota_in_progress</w:t>
       </w:r>
       <w:r>
         <w:t xml:space="preserve">, log </w:t>
@@ -17655,7 +16021,7 @@
           <w:rFonts w:ascii="Consolas" w:hAnsi="Consolas"/>
           <w:sz w:val="22"/>
         </w:rPr>
-        <w:t>hmac\_reject</w:t>
+        <w:t>hmac_reject</w:t>
       </w:r>
       <w:r>
         <w:t xml:space="preserve">. Trong 100 lần thử, </w:t>
@@ -17743,7 +16109,7 @@
           <w:rFonts w:ascii="Consolas" w:hAnsi="Consolas"/>
           <w:sz w:val="22"/>
         </w:rPr>
-        <w:t>last\_seq</w:t>
+        <w:t>last_seq</w:t>
       </w:r>
       <w:r>
         <w:t xml:space="preserve"> hiện tại, bị reject với </w:t>
@@ -17753,7 +16119,7 @@
           <w:rFonts w:ascii="Consolas" w:hAnsi="Consolas"/>
           <w:sz w:val="22"/>
         </w:rPr>
-        <w:t>replay\_reject</w:t>
+        <w:t>replay_reject</w:t>
       </w:r>
       <w:r>
         <w:t>. Ngoài ra, nếu chờ đến hết giờ (&gt;1 giờ), khoá epoch đã đổi, HMAC cũng không khớp nên chống được cả replay dài hạn.</w:t>
@@ -17780,7 +16146,7 @@
         <w:rPr>
           <w:b/>
         </w:rPr>
-        <w:t>0.12\%</w:t>
+        <w:t>0.12%</w:t>
       </w:r>
       <w:r>
         <w:t xml:space="preserve"> false-negative (34 reject / 28654 received). Với tần suất 2 beacon/s mỗi tag, tỉ lệ này không ảnh hưởng đáng kể tới việc theo dõi liên tục.</w:t>
@@ -18607,7 +16973,7 @@
         <w:rPr>
           <w:b/>
         </w:rPr>
-        <w:t>Kiến trúc phân tầng edge--gateway--server</w:t>
+        <w:t>Kiến trúc phân tầng edge–gateway–server</w:t>
       </w:r>
       <w:r>
         <w:t>. Firmware chỉ chuyển dữ liệu thô; toàn bộ thuật toán quyết định phòng (hysteresis, debounce leaky-bucket) chạy trên ThingsBoard rule chain. Tinh chỉnh ngưỡng qua UI, không phải flash lại firmware.</w:t>
@@ -18659,7 +17025,7 @@
           <w:rFonts w:ascii="Consolas" w:hAnsi="Consolas"/>
           <w:sz w:val="22"/>
         </w:rPr>
-        <w:t>RESET\_CMD</w:t>
+        <w:t>RESET_CMD</w:t>
       </w:r>
       <w:r>
         <w:t>, wipe NVS và re-provision cả mesh khi không còn nghe traffic. Node table và cấu hình mesh được persist NVS để bring-up sau mất điện chỉ tốn 8–12 s.</w:t>
@@ -18811,7 +17177,7 @@
         <w:rPr>
           <w:b/>
         </w:rPr>
-        <w:t>Chưa test trong môi trường có nhiễu 2.4~GHz nặng</w:t>
+        <w:t>Chưa test trong môi trường có nhiễu 2.4 GHz nặng</w:t>
       </w:r>
       <w:r>
         <w:t>. Nhà máy sản xuất có nhiều motor và WiFi mật độ cao có thể ảnh hưởng RSSI.</w:t>
@@ -19266,7 +17632,7 @@
     </w:lvl>
   </w:abstractNum>
   <w:abstractNum w:abstractNumId="3">
-    <w:nsid w:val="05B4983F"/>
+    <w:nsid w:val="030A0B87"/>
     <w:multiLevelType w:val="singleLevel"/>
     <w:tmpl w:val="29761A62"/>
     <w:lvl w:ilvl="0">
@@ -19287,7 +17653,7 @@
     </w:lvl>
   </w:abstractNum>
   <w:abstractNum w:abstractNumId="4">
-    <w:nsid w:val="03D45D63"/>
+    <w:nsid w:val="05818014"/>
     <w:multiLevelType w:val="singleLevel"/>
     <w:tmpl w:val="D0A62B40"/>
     <w:lvl w:ilvl="0">
@@ -19315,15 +17681,6 @@
   </w:num>
   <w:num w:numId="5">
     <w:abstractNumId w:val="4"/>
-    <w:lvlOverride w:ilvl="0">
-      <w:startOverride w:val="1"/>
-    </w:lvlOverride>
-  </w:num>
-  <w:num w:numId="6">
-    <w:abstractNumId w:val="4"/>
-    <w:lvlOverride w:ilvl="0">
-      <w:startOverride w:val="1"/>
-    </w:lvlOverride>
     <w:lvlOverride w:ilvl="0">
       <w:startOverride w:val="1"/>
     </w:lvlOverride>

</xml_diff>

<commit_message>
[UPDATE] thesis's report, add author and newpapers
</commit_message>
<xml_diff>
--- a/thesis/khoa-luan.docx
+++ b/thesis/khoa-luan.docx
@@ -391,12 +391,7 @@
         </w:rPr>
       </w:pPr>
       <w:r>
-        <w:rPr>
-          <w:b/>
-          <w:sz w:val="38"/>
-          <w:szCs w:val="48"/>
-        </w:rPr>
-        <w:t>CAO TRỌNG PHƯỚC</w:t>
+        <w:t>CAO TRỌNG PHƯỚC – TĂNG SĨ THÔNG</w:t>
       </w:r>
     </w:p>
     <w:p>
@@ -1138,42 +1133,7 @@
         </w:rPr>
       </w:pPr>
       <w:r>
-        <w:rPr>
-          <w:b/>
-          <w:color w:val="993366"/>
-          <w:sz w:val="32"/>
-        </w:rPr>
-        <w:t>CAO TRỌNG PHƯỚC</w:t>
-      </w:r>
-      <w:r>
-        <w:rPr>
-          <w:rFonts w:cs="Times New Roman" w:ascii="Times New Roman" w:hAnsi="Times New Roman"/>
-          <w:b/>
-          <w:color w:val="993366"/>
-          <w:sz w:val="32"/>
-        </w:rPr>
-      </w:r>
-      <w:r>
-        <w:rPr>
-          <w:b/>
-          <w:color w:val="993366"/>
-          <w:sz w:val="32"/>
-        </w:rPr>
-      </w:r>
-      <w:r>
-        <w:rPr>
-          <w:rFonts w:cs="Times New Roman" w:ascii="Times New Roman" w:hAnsi="Times New Roman"/>
-          <w:b/>
-          <w:color w:val="993366"/>
-          <w:sz w:val="32"/>
-        </w:rPr>
-      </w:r>
-      <w:r>
-        <w:rPr>
-          <w:b/>
-          <w:color w:val="993366"/>
-          <w:sz w:val="32"/>
-        </w:rPr>
+        <w:t>CAO TRỌNG PHƯỚC – TĂNG SĨ THÔNG</w:t>
       </w:r>
     </w:p>
     <w:p>
@@ -1335,64 +1295,6 @@
     <w:p>
       <w:pPr>
         <w:pStyle w:val="Normal"/>
-        <w:tabs>
-          <w:tab w:val="clear" w:pos="720"/>
-          <w:tab w:val="left" w:pos="3360" w:leader="none"/>
-          <w:tab w:val="left" w:pos="4800" w:leader="none"/>
-        </w:tabs>
-        <w:spacing w:before="80" w:after="80"/>
-        <w:jc w:val="center"/>
-        <w:rPr>
-          <w:rFonts w:ascii="Times New Roman" w:hAnsi="Times New Roman" w:cs="Times New Roman"/>
-          <w:b/>
-          <w:color w:val="000080"/>
-          <w:sz w:val="30"/>
-          <w:szCs w:val="30"/>
-        </w:rPr>
-      </w:pPr>
-      <w:r>
-        <w:rPr>
-          <w:rFonts w:cs="Times New Roman" w:ascii="Times New Roman" w:hAnsi="Times New Roman"/>
-          <w:b/>
-          <w:color w:val="000080"/>
-          <w:sz w:val="30"/>
-          <w:szCs w:val="30"/>
-        </w:rPr>
-        <w:t xml:space="preserve">ROOM-LEVEL INDOOR POSITIONING SYSTEM </w:t>
-      </w:r>
-    </w:p>
-    <w:p>
-      <w:pPr>
-        <w:pStyle w:val="Normal"/>
-        <w:tabs>
-          <w:tab w:val="clear" w:pos="720"/>
-          <w:tab w:val="left" w:pos="3360" w:leader="none"/>
-          <w:tab w:val="left" w:pos="4800" w:leader="none"/>
-        </w:tabs>
-        <w:spacing w:before="80" w:after="80"/>
-        <w:jc w:val="center"/>
-        <w:rPr>
-          <w:rFonts w:ascii="Times New Roman" w:hAnsi="Times New Roman" w:cs="Times New Roman"/>
-          <w:b/>
-          <w:color w:val="000080"/>
-          <w:sz w:val="30"/>
-          <w:szCs w:val="30"/>
-        </w:rPr>
-      </w:pPr>
-      <w:r>
-        <w:rPr>
-          <w:rFonts w:cs="Times New Roman" w:ascii="Times New Roman" w:hAnsi="Times New Roman"/>
-          <w:b/>
-          <w:color w:val="000080"/>
-          <w:sz w:val="30"/>
-          <w:szCs w:val="30"/>
-        </w:rPr>
-        <w:t>BASED ON BLE MESH AND ESP32</w:t>
-      </w:r>
-    </w:p>
-    <w:p>
-      <w:pPr>
-        <w:pStyle w:val="Normal"/>
         <w:jc w:val="center"/>
         <w:rPr>
           <w:rFonts w:ascii="Times New Roman" w:hAnsi="Times New Roman" w:cs="Times New Roman"/>
@@ -1578,14 +1480,15 @@
         </w:rPr>
       </w:pPr>
       <w:r>
-        <w:rPr>
-          <w:rFonts w:cs="Times New Roman" w:ascii="Times New Roman" w:hAnsi="Times New Roman"/>
-          <w:b/>
-          <w:color w:val="000080"/>
-        </w:rPr>
-        <w:t>TS.</w:t>
-        <w:tab/>
-        <w:t>HUỲNH HỮU THUẬN</w:t>
+        <w:t>TS. HUỲNH HỮU THUẬN</w:t>
+      </w:r>
+    </w:p>
+    <w:p>
+      <w:pPr>
+        <w:jc w:val="center"/>
+      </w:pPr>
+      <w:r>
+        <w:t>Trưởng Bộ môn Máy tính – Hệ thống nhúng</w:t>
       </w:r>
     </w:p>
     <w:p>
@@ -1732,36 +1635,27 @@
         <w:jc w:val="both"/>
       </w:pPr>
       <w:r>
-        <w:t xml:space="preserve">Tôi xin cam đoan khoá luận tốt nghiệp </w:t>
-      </w:r>
-      <w:r>
-        <w:rPr>
-          <w:b/>
-        </w:rPr>
-        <w:t>“Hệ thống định vị trong nhà theo phòng dựa trên BLE Mesh và ESP32, tích hợp thu thập – xử lý dữ liệu qua ThingsBoard”</w:t>
-      </w:r>
-      <w:r>
-        <w:t xml:space="preserve"> là công trình nghiên cứu của bản thân tôi dưới sự hướng dẫn của TS. Huỳnh Hữu Thuận.</w:t>
-      </w:r>
-    </w:p>
-    <w:p>
-      <w:pPr>
-        <w:spacing w:after="120"/>
-        <w:ind w:firstLine="432"/>
-        <w:jc w:val="both"/>
-      </w:pPr>
-      <w:r>
-        <w:t>Các số liệu, kết quả thực nghiệm nêu trong khoá luận là trung thực, do chính tôi thực hiện và chưa từng được công bố trong bất kỳ công trình nào khác. Các nguồn tài liệu được sử dụng đều được trích dẫn đầy đủ, rõ ràng trong phần Tài liệu tham khảo.</w:t>
-      </w:r>
-    </w:p>
-    <w:p>
-      <w:pPr>
-        <w:spacing w:after="120"/>
-        <w:ind w:firstLine="432"/>
-        <w:jc w:val="both"/>
-      </w:pPr>
-      <w:r>
-        <w:t>Tôi hoàn toàn chịu trách nhiệm trước Nhà trường và Khoa Điện tử – Viễn thông về lời cam đoan này.</w:t>
+        <w:t>Chúng tôi xin cam đoan khoá luận tốt nghiệp “Hệ thống định vị trong nhà theo phòng dựa trên BLE Mesh và ESP32, tích hợp thu thập – xử lý dữ liệu qua ThingsBoard” là công trình nghiên cứu của chúng tôi dưới sự hướng dẫn của TS. Huỳnh Hữu Thuận.</w:t>
+      </w:r>
+    </w:p>
+    <w:p>
+      <w:pPr>
+        <w:spacing w:after="120"/>
+        <w:ind w:firstLine="432"/>
+        <w:jc w:val="both"/>
+      </w:pPr>
+      <w:r>
+        <w:t>Các số liệu, kết quả thực nghiệm nêu trong khoá luận là trung thực, do chúng tôi thực hiện và chưa từng được công bố trong bất kỳ công trình nào khác. Các nguồn tài liệu được sử dụng đều được trích dẫn đầy đủ, rõ ràng trong phần Tài liệu tham khảo.</w:t>
+      </w:r>
+    </w:p>
+    <w:p>
+      <w:pPr>
+        <w:spacing w:after="120"/>
+        <w:ind w:firstLine="432"/>
+        <w:jc w:val="both"/>
+      </w:pPr>
+      <w:r>
+        <w:t>Chúng tôi hoàn toàn chịu trách nhiệm trước Nhà trường và Khoa Điện tử – Viễn thông về lời cam đoan này.</w:t>
       </w:r>
     </w:p>
     <w:p>
@@ -1788,10 +1682,7 @@
         <w:jc w:val="right"/>
       </w:pPr>
       <w:r>
-        <w:rPr>
-          <w:b/>
-        </w:rPr>
-        <w:t>Cao Trọng Phước</w:t>
+        <w:t>Cao Trọng Phước – Tăng Sĩ Thông</w:t>
       </w:r>
     </w:p>
     <w:p/>
@@ -1854,6 +1745,586 @@
       </w:r>
     </w:p>
     <w:p/>
+    <w:p>
+      <w:pPr>
+        <w:pStyle w:val="Heading1"/>
+        <w:jc w:val="center"/>
+        <w:pageBreakBefore/>
+      </w:pPr>
+      <w:r>
+        <w:t>MỤC LỤC</w:t>
+      </w:r>
+    </w:p>
+    <w:p>
+      <w:pPr/>
+      <w:r>
+        <w:fldChar w:fldCharType="begin" w:dirty="true"/>
+      </w:r>
+      <w:r>
+        <w:instrText xml:space="preserve"> TOC \o "1-3" \h \z \u </w:instrText>
+      </w:r>
+      <w:r>
+        <w:fldChar w:fldCharType="separate"/>
+      </w:r>
+      <w:r>
+        <w:t>Mục lục sẽ được cập nhật khi mở tài liệu.</w:t>
+      </w:r>
+      <w:r>
+        <w:fldChar w:fldCharType="end"/>
+      </w:r>
+    </w:p>
+    <w:p>
+      <w:pPr>
+        <w:pStyle w:val="Heading1"/>
+        <w:jc w:val="center"/>
+        <w:pageBreakBefore/>
+      </w:pPr>
+      <w:r>
+        <w:t>DANH MỤC TỪ VIẾT TẮT</w:t>
+      </w:r>
+    </w:p>
+    <w:tbl>
+      <w:tblPr>
+        <w:tblStyle w:val="TableGrid"/>
+        <w:tblW w:type="auto" w:w="0"/>
+        <w:jc w:val="center"/>
+        <w:tblLook w:firstColumn="1" w:firstRow="1" w:lastColumn="0" w:lastRow="0" w:noHBand="0" w:noVBand="1" w:val="04A0"/>
+      </w:tblPr>
+      <w:tblGrid>
+        <w:gridCol w:w="3360"/>
+        <w:gridCol w:w="3360"/>
+        <w:gridCol w:w="3360"/>
+      </w:tblGrid>
+      <w:tr>
+        <w:tc>
+          <w:tcPr>
+            <w:tcW w:type="dxa" w:w="3360"/>
+            <w:vAlign w:val="center"/>
+          </w:tcPr>
+          <w:p>
+            <w:pPr>
+              <w:spacing w:after="0"/>
+              <w:ind w:firstLine="0"/>
+              <w:jc w:val="center"/>
+            </w:pPr>
+            <w:r>
+              <w:rPr>
+                <w:b/>
+              </w:rPr>
+              <w:t>Từ viết tắt</w:t>
+            </w:r>
+          </w:p>
+        </w:tc>
+        <w:tc>
+          <w:tcPr>
+            <w:tcW w:type="dxa" w:w="3360"/>
+            <w:vAlign w:val="center"/>
+          </w:tcPr>
+          <w:p>
+            <w:pPr>
+              <w:spacing w:after="0"/>
+              <w:ind w:firstLine="0"/>
+              <w:jc w:val="center"/>
+            </w:pPr>
+            <w:r>
+              <w:rPr>
+                <w:b/>
+              </w:rPr>
+              <w:t>Tên đầy đủ</w:t>
+            </w:r>
+          </w:p>
+        </w:tc>
+        <w:tc>
+          <w:tcPr>
+            <w:tcW w:type="dxa" w:w="3360"/>
+            <w:vAlign w:val="center"/>
+          </w:tcPr>
+          <w:p>
+            <w:pPr>
+              <w:spacing w:after="0"/>
+              <w:ind w:firstLine="0"/>
+              <w:jc w:val="center"/>
+            </w:pPr>
+            <w:r>
+              <w:rPr>
+                <w:b/>
+              </w:rPr>
+              <w:t>Ý nghĩa</w:t>
+            </w:r>
+          </w:p>
+        </w:tc>
+      </w:tr>
+      <w:tr>
+        <w:tc>
+          <w:tcPr>
+            <w:tcW w:type="dxa" w:w="3360"/>
+            <w:vAlign w:val="center"/>
+          </w:tcPr>
+          <w:p>
+            <w:pPr>
+              <w:spacing w:after="0"/>
+              <w:ind w:firstLine="0"/>
+            </w:pPr>
+            <w:r>
+              <w:t>BLE</w:t>
+            </w:r>
+          </w:p>
+        </w:tc>
+        <w:tc>
+          <w:tcPr>
+            <w:tcW w:type="dxa" w:w="3360"/>
+            <w:vAlign w:val="center"/>
+          </w:tcPr>
+          <w:p>
+            <w:pPr>
+              <w:spacing w:after="0"/>
+              <w:ind w:firstLine="0"/>
+            </w:pPr>
+            <w:r>
+              <w:t>Bluetooth Low Energy</w:t>
+            </w:r>
+          </w:p>
+        </w:tc>
+        <w:tc>
+          <w:tcPr>
+            <w:tcW w:type="dxa" w:w="3360"/>
+            <w:vAlign w:val="center"/>
+          </w:tcPr>
+          <w:p>
+            <w:pPr>
+              <w:spacing w:after="0"/>
+              <w:ind w:firstLine="0"/>
+            </w:pPr>
+            <w:r>
+              <w:t>Bluetooth năng lượng thấp</w:t>
+            </w:r>
+          </w:p>
+        </w:tc>
+      </w:tr>
+      <w:tr>
+        <w:tc>
+          <w:tcPr>
+            <w:tcW w:type="dxa" w:w="3360"/>
+            <w:vAlign w:val="center"/>
+          </w:tcPr>
+          <w:p>
+            <w:pPr>
+              <w:spacing w:after="0"/>
+              <w:ind w:firstLine="0"/>
+            </w:pPr>
+            <w:r>
+              <w:t>RSSI</w:t>
+            </w:r>
+          </w:p>
+        </w:tc>
+        <w:tc>
+          <w:tcPr>
+            <w:tcW w:type="dxa" w:w="3360"/>
+            <w:vAlign w:val="center"/>
+          </w:tcPr>
+          <w:p>
+            <w:pPr>
+              <w:spacing w:after="0"/>
+              <w:ind w:firstLine="0"/>
+            </w:pPr>
+            <w:r>
+              <w:t>Received Signal Strength Indicator</w:t>
+            </w:r>
+          </w:p>
+        </w:tc>
+        <w:tc>
+          <w:tcPr>
+            <w:tcW w:type="dxa" w:w="3360"/>
+            <w:vAlign w:val="center"/>
+          </w:tcPr>
+          <w:p>
+            <w:pPr>
+              <w:spacing w:after="0"/>
+              <w:ind w:firstLine="0"/>
+            </w:pPr>
+            <w:r>
+              <w:t>Chỉ số cường độ tín hiệu nhận</w:t>
+            </w:r>
+          </w:p>
+        </w:tc>
+      </w:tr>
+      <w:tr>
+        <w:tc>
+          <w:tcPr>
+            <w:tcW w:type="dxa" w:w="3360"/>
+            <w:vAlign w:val="center"/>
+          </w:tcPr>
+          <w:p>
+            <w:pPr>
+              <w:spacing w:after="0"/>
+              <w:ind w:firstLine="0"/>
+            </w:pPr>
+            <w:r>
+              <w:t>HMAC</w:t>
+            </w:r>
+          </w:p>
+        </w:tc>
+        <w:tc>
+          <w:tcPr>
+            <w:tcW w:type="dxa" w:w="3360"/>
+            <w:vAlign w:val="center"/>
+          </w:tcPr>
+          <w:p>
+            <w:pPr>
+              <w:spacing w:after="0"/>
+              <w:ind w:firstLine="0"/>
+            </w:pPr>
+            <w:r>
+              <w:t>Hash-based Message Authentication Code</w:t>
+            </w:r>
+          </w:p>
+        </w:tc>
+        <w:tc>
+          <w:tcPr>
+            <w:tcW w:type="dxa" w:w="3360"/>
+            <w:vAlign w:val="center"/>
+          </w:tcPr>
+          <w:p>
+            <w:pPr>
+              <w:spacing w:after="0"/>
+              <w:ind w:firstLine="0"/>
+            </w:pPr>
+            <w:r>
+              <w:t>Mã xác thực dựa trên hàm băm</w:t>
+            </w:r>
+          </w:p>
+        </w:tc>
+      </w:tr>
+      <w:tr>
+        <w:tc>
+          <w:tcPr>
+            <w:tcW w:type="dxa" w:w="3360"/>
+            <w:vAlign w:val="center"/>
+          </w:tcPr>
+          <w:p>
+            <w:pPr>
+              <w:spacing w:after="0"/>
+              <w:ind w:firstLine="0"/>
+            </w:pPr>
+            <w:r>
+              <w:t>MQTT</w:t>
+            </w:r>
+          </w:p>
+        </w:tc>
+        <w:tc>
+          <w:tcPr>
+            <w:tcW w:type="dxa" w:w="3360"/>
+            <w:vAlign w:val="center"/>
+          </w:tcPr>
+          <w:p>
+            <w:pPr>
+              <w:spacing w:after="0"/>
+              <w:ind w:firstLine="0"/>
+            </w:pPr>
+            <w:r>
+              <w:t>Message Queuing Telemetry Transport</w:t>
+            </w:r>
+          </w:p>
+        </w:tc>
+        <w:tc>
+          <w:tcPr>
+            <w:tcW w:type="dxa" w:w="3360"/>
+            <w:vAlign w:val="center"/>
+          </w:tcPr>
+          <w:p>
+            <w:pPr>
+              <w:spacing w:after="0"/>
+              <w:ind w:firstLine="0"/>
+            </w:pPr>
+            <w:r>
+              <w:t>Giao thức truyền dữ liệu IoT</w:t>
+            </w:r>
+          </w:p>
+        </w:tc>
+      </w:tr>
+      <w:tr>
+        <w:tc>
+          <w:tcPr>
+            <w:tcW w:type="dxa" w:w="3360"/>
+            <w:vAlign w:val="center"/>
+          </w:tcPr>
+          <w:p>
+            <w:pPr>
+              <w:spacing w:after="0"/>
+              <w:ind w:firstLine="0"/>
+            </w:pPr>
+            <w:r>
+              <w:t>TLS</w:t>
+            </w:r>
+          </w:p>
+        </w:tc>
+        <w:tc>
+          <w:tcPr>
+            <w:tcW w:type="dxa" w:w="3360"/>
+            <w:vAlign w:val="center"/>
+          </w:tcPr>
+          <w:p>
+            <w:pPr>
+              <w:spacing w:after="0"/>
+              <w:ind w:firstLine="0"/>
+            </w:pPr>
+            <w:r>
+              <w:t>Transport Layer Security</w:t>
+            </w:r>
+          </w:p>
+        </w:tc>
+        <w:tc>
+          <w:tcPr>
+            <w:tcW w:type="dxa" w:w="3360"/>
+            <w:vAlign w:val="center"/>
+          </w:tcPr>
+          <w:p>
+            <w:pPr>
+              <w:spacing w:after="0"/>
+              <w:ind w:firstLine="0"/>
+            </w:pPr>
+            <w:r>
+              <w:t>Bảo mật lớp truyền</w:t>
+            </w:r>
+          </w:p>
+        </w:tc>
+      </w:tr>
+      <w:tr>
+        <w:tc>
+          <w:tcPr>
+            <w:tcW w:type="dxa" w:w="3360"/>
+            <w:vAlign w:val="center"/>
+          </w:tcPr>
+          <w:p>
+            <w:pPr>
+              <w:spacing w:after="0"/>
+              <w:ind w:firstLine="0"/>
+            </w:pPr>
+            <w:r>
+              <w:t>OTA</w:t>
+            </w:r>
+          </w:p>
+        </w:tc>
+        <w:tc>
+          <w:tcPr>
+            <w:tcW w:type="dxa" w:w="3360"/>
+            <w:vAlign w:val="center"/>
+          </w:tcPr>
+          <w:p>
+            <w:pPr>
+              <w:spacing w:after="0"/>
+              <w:ind w:firstLine="0"/>
+            </w:pPr>
+            <w:r>
+              <w:t>Over-the-Air</w:t>
+            </w:r>
+          </w:p>
+        </w:tc>
+        <w:tc>
+          <w:tcPr>
+            <w:tcW w:type="dxa" w:w="3360"/>
+            <w:vAlign w:val="center"/>
+          </w:tcPr>
+          <w:p>
+            <w:pPr>
+              <w:spacing w:after="0"/>
+              <w:ind w:firstLine="0"/>
+            </w:pPr>
+            <w:r>
+              <w:t>Cập nhật chương trình qua mạng</w:t>
+            </w:r>
+          </w:p>
+        </w:tc>
+      </w:tr>
+      <w:tr>
+        <w:tc>
+          <w:tcPr>
+            <w:tcW w:type="dxa" w:w="3360"/>
+            <w:vAlign w:val="center"/>
+          </w:tcPr>
+          <w:p>
+            <w:pPr>
+              <w:spacing w:after="0"/>
+              <w:ind w:firstLine="0"/>
+            </w:pPr>
+            <w:r>
+              <w:t>NVS</w:t>
+            </w:r>
+          </w:p>
+        </w:tc>
+        <w:tc>
+          <w:tcPr>
+            <w:tcW w:type="dxa" w:w="3360"/>
+            <w:vAlign w:val="center"/>
+          </w:tcPr>
+          <w:p>
+            <w:pPr>
+              <w:spacing w:after="0"/>
+              <w:ind w:firstLine="0"/>
+            </w:pPr>
+            <w:r>
+              <w:t>Non-Volatile Storage</w:t>
+            </w:r>
+          </w:p>
+        </w:tc>
+        <w:tc>
+          <w:tcPr>
+            <w:tcW w:type="dxa" w:w="3360"/>
+            <w:vAlign w:val="center"/>
+          </w:tcPr>
+          <w:p>
+            <w:pPr>
+              <w:spacing w:after="0"/>
+              <w:ind w:firstLine="0"/>
+            </w:pPr>
+            <w:r>
+              <w:t>Bộ nhớ không mất dữ liệu</w:t>
+            </w:r>
+          </w:p>
+        </w:tc>
+      </w:tr>
+      <w:tr>
+        <w:tc>
+          <w:tcPr>
+            <w:tcW w:type="dxa" w:w="3360"/>
+            <w:vAlign w:val="center"/>
+          </w:tcPr>
+          <w:p>
+            <w:pPr>
+              <w:spacing w:after="0"/>
+              <w:ind w:firstLine="0"/>
+            </w:pPr>
+            <w:r>
+              <w:t>OOB</w:t>
+            </w:r>
+          </w:p>
+        </w:tc>
+        <w:tc>
+          <w:tcPr>
+            <w:tcW w:type="dxa" w:w="3360"/>
+            <w:vAlign w:val="center"/>
+          </w:tcPr>
+          <w:p>
+            <w:pPr>
+              <w:spacing w:after="0"/>
+              <w:ind w:firstLine="0"/>
+            </w:pPr>
+            <w:r>
+              <w:t>Out-of-Band</w:t>
+            </w:r>
+          </w:p>
+        </w:tc>
+        <w:tc>
+          <w:tcPr>
+            <w:tcW w:type="dxa" w:w="3360"/>
+            <w:vAlign w:val="center"/>
+          </w:tcPr>
+          <w:p>
+            <w:pPr>
+              <w:spacing w:after="0"/>
+              <w:ind w:firstLine="0"/>
+            </w:pPr>
+            <w:r>
+              <w:t>Kênh xác thực ngoài</w:t>
+            </w:r>
+          </w:p>
+        </w:tc>
+      </w:tr>
+      <w:tr>
+        <w:tc>
+          <w:tcPr>
+            <w:tcW w:type="dxa" w:w="3360"/>
+            <w:vAlign w:val="center"/>
+          </w:tcPr>
+          <w:p>
+            <w:pPr>
+              <w:spacing w:after="0"/>
+              <w:ind w:firstLine="0"/>
+            </w:pPr>
+            <w:r>
+              <w:t>UWB</w:t>
+            </w:r>
+          </w:p>
+        </w:tc>
+        <w:tc>
+          <w:tcPr>
+            <w:tcW w:type="dxa" w:w="3360"/>
+            <w:vAlign w:val="center"/>
+          </w:tcPr>
+          <w:p>
+            <w:pPr>
+              <w:spacing w:after="0"/>
+              <w:ind w:firstLine="0"/>
+            </w:pPr>
+            <w:r>
+              <w:t>Ultra-Wideband</w:t>
+            </w:r>
+          </w:p>
+        </w:tc>
+        <w:tc>
+          <w:tcPr>
+            <w:tcW w:type="dxa" w:w="3360"/>
+            <w:vAlign w:val="center"/>
+          </w:tcPr>
+          <w:p>
+            <w:pPr>
+              <w:spacing w:after="0"/>
+              <w:ind w:firstLine="0"/>
+            </w:pPr>
+            <w:r>
+              <w:t>Băng thông siêu rộng</w:t>
+            </w:r>
+          </w:p>
+        </w:tc>
+      </w:tr>
+      <w:tr>
+        <w:tc>
+          <w:tcPr>
+            <w:tcW w:type="dxa" w:w="3360"/>
+            <w:vAlign w:val="center"/>
+          </w:tcPr>
+          <w:p>
+            <w:pPr>
+              <w:spacing w:after="0"/>
+              <w:ind w:firstLine="0"/>
+            </w:pPr>
+            <w:r>
+              <w:t>UUID</w:t>
+            </w:r>
+          </w:p>
+        </w:tc>
+        <w:tc>
+          <w:tcPr>
+            <w:tcW w:type="dxa" w:w="3360"/>
+            <w:vAlign w:val="center"/>
+          </w:tcPr>
+          <w:p>
+            <w:pPr>
+              <w:spacing w:after="0"/>
+              <w:ind w:firstLine="0"/>
+            </w:pPr>
+            <w:r>
+              <w:t>Universally Unique Identifier</w:t>
+            </w:r>
+          </w:p>
+        </w:tc>
+        <w:tc>
+          <w:tcPr>
+            <w:tcW w:type="dxa" w:w="3360"/>
+            <w:vAlign w:val="center"/>
+          </w:tcPr>
+          <w:p>
+            <w:pPr>
+              <w:spacing w:after="0"/>
+              <w:ind w:firstLine="0"/>
+            </w:pPr>
+            <w:r>
+              <w:t>Mã định danh duy nhất</w:t>
+            </w:r>
+          </w:p>
+        </w:tc>
+      </w:tr>
+    </w:tbl>
     <w:p>
       <w:pPr>
         <w:pStyle w:val="Heading1"/>
@@ -2746,13 +3217,7 @@
         <w:pStyle w:val="ListBullet"/>
       </w:pPr>
       <w:r>
-        <w:rPr>
-          <w:b/>
-        </w:rPr>
-        <w:t>Chương 4 – Triển khai hệ thống:</w:t>
-      </w:r>
-      <w:r>
-        <w:t xml:space="preserve"> Kiến trúc tổng thể; firmware của bốn loại node (Tag, Scanner, Relay, Gateway); cấu hình server ThingsBoard (Docker, rule chain, dashboard); bảo mật end-to-end; cơ chế OTA; cấu trúc mã nguồn.</w:t>
+        <w:t>Chương 4 – Triển khai hệ thống: Kiến trúc tổng thể; firmware của bốn loại node (Tag, Scanner, Relay, Gateway); cấu hình server ThingsBoard (Docker, rule chain, dashboard); bảo mật xuyên suốt; cơ chế OTA; cấu trúc mã nguồn.</w:t>
       </w:r>
     </w:p>
     <w:p>
@@ -2950,6 +3415,92 @@
       <w:r>
         <w:t xml:space="preserve"> (Google). Đầu quét đọc RSSI, ước lượng khoảng cách bằng log-distance path loss:</w:t>
       </w:r>
+    </w:p>
+    <w:p>
+      <w:pPr>
+        <w:ind w:firstLine="0"/>
+        <w:jc w:val="center"/>
+      </w:pPr>
+      <m:oMathPara xmlns:m="http://schemas.openxmlformats.org/officeDocument/2006/math">
+        <m:oMath>
+          <m:r>
+            <m:rPr>
+              <m:sty m:val="p"/>
+            </m:rPr>
+            <m:t>d = </m:t>
+          </m:r>
+          <m:sSup>
+            <m:e>
+              <m:r>
+                <m:rPr>
+                  <m:sty m:val="p"/>
+                </m:rPr>
+                <m:t>10</m:t>
+              </m:r>
+            </m:e>
+            <m:sup>
+              <m:f>
+                <m:num>
+                  <m:box>
+                    <m:e>
+                      <m:sSub>
+                        <m:e>
+                          <m:r>
+                            <m:rPr>
+                              <m:sty m:val="p"/>
+                            </m:rPr>
+                            <m:t>P</m:t>
+                          </m:r>
+                        </m:e>
+                        <m:sub>
+                          <m:r>
+                            <m:rPr>
+                              <m:sty m:val="p"/>
+                            </m:rPr>
+                            <m:t>0</m:t>
+                          </m:r>
+                        </m:sub>
+                      </m:sSub>
+                      <m:r>
+                        <m:rPr>
+                          <m:sty m:val="p"/>
+                        </m:rPr>
+                        <m:t> − </m:t>
+                      </m:r>
+                      <m:sSub>
+                        <m:e>
+                          <m:r>
+                            <m:rPr>
+                              <m:sty m:val="p"/>
+                            </m:rPr>
+                            <m:t>P</m:t>
+                          </m:r>
+                        </m:e>
+                        <m:sub>
+                          <m:r>
+                            <m:rPr>
+                              <m:sty m:val="p"/>
+                            </m:rPr>
+                            <m:t>r</m:t>
+                          </m:r>
+                        </m:sub>
+                      </m:sSub>
+                    </m:e>
+                  </m:box>
+                </m:num>
+                <m:den>
+                  <m:r>
+                    <m:rPr>
+                      <m:sty m:val="p"/>
+                    </m:rPr>
+                    <m:t>10n</m:t>
+                  </m:r>
+                </m:den>
+              </m:f>
+            </m:sup>
+          </m:sSup>
+        </m:oMath>
+      </m:oMathPara>
     </w:p>
     <w:p xmlns:m="http://schemas.openxmlformats.org/officeDocument/2006/math">
       <w:pPr>
@@ -3993,22 +4544,7 @@
         <w:jc w:val="both"/>
       </w:pPr>
       <w:r>
-        <w:t xml:space="preserve">Rondón </w:t>
-      </w:r>
-      <w:r>
-        <w:rPr>
-          <w:i/>
-        </w:rPr>
-        <w:t>và cộng sự</w:t>
-      </w:r>
-      <w:r>
-        <w:t xml:space="preserve"> </w:t>
-      </w:r>
-      <w:r>
-        <w:t>[rondon-ble-mesh]</w:t>
-      </w:r>
-      <w:r>
-        <w:t xml:space="preserve"> đo trên mesh 50 node: độ trễ end-to-end trung bình 200–500 ms cho gói vendor-specific 20 byte qua 3–5 hop. Đủ cho telemetry tần suất thấp (tag mỗi 1–2 s như đề tài).</w:t>
+        <w:t>Rondón và cộng sự [rondon-ble-mesh] đo trên mesh 50 node: độ trễ xuyên suốt trung bình 200–500 ms cho gói vendor-specific 20 byte qua 3–5 hop. Đủ cho telemetry tần suất thấp (tag mỗi 1–2 s như đề tài).</w:t>
       </w:r>
     </w:p>
     <w:p>
@@ -4052,13 +4588,7 @@
         <w:pStyle w:val="ListBullet"/>
       </w:pPr>
       <w:r>
-        <w:rPr>
-          <w:b/>
-        </w:rPr>
-        <w:t>Thiếu mã nguồn mở end-to-end tự host được</w:t>
-      </w:r>
-      <w:r>
-        <w:t>. Nghiên cứu học thuật thường chỉ giải quyết một phần (lọc RSSI, thuật toán zone), không có full stack. Giải pháp thương mại đóng nguồn, khoá vào cloud riêng. Người dùng muốn hiểu và sửa hệ thống không có lựa chọn.</w:t>
+        <w:t>Thiếu mã nguồn mở xuyên suốt tự host được. Nghiên cứu học thuật thường chỉ giải quyết một phần (lọc RSSI, thuật toán zone), không có full stack. Giải pháp thương mại đóng nguồn, khoá vào cloud riêng. Người dùng muốn hiểu và sửa hệ thống không có lựa chọn.</w:t>
       </w:r>
     </w:p>
     <w:p>
@@ -4424,6 +4954,144 @@
       <w:r>
         <w:t>:</w:t>
       </w:r>
+    </w:p>
+    <w:p>
+      <w:pPr>
+        <w:ind w:firstLine="0"/>
+        <w:jc w:val="center"/>
+      </w:pPr>
+      <m:oMathPara xmlns:m="http://schemas.openxmlformats.org/officeDocument/2006/math">
+        <m:oMath>
+          <m:sSub>
+            <m:e>
+              <m:r>
+                <m:rPr>
+                  <m:sty m:val="p"/>
+                </m:rPr>
+                <m:t>P</m:t>
+              </m:r>
+            </m:e>
+            <m:sub>
+              <m:r>
+                <m:rPr>
+                  <m:sty m:val="p"/>
+                </m:rPr>
+                <m:t>r</m:t>
+              </m:r>
+            </m:sub>
+          </m:sSub>
+          <m:r>
+            <m:rPr>
+              <m:sty m:val="p"/>
+            </m:rPr>
+            <m:t>(d) = </m:t>
+          </m:r>
+          <m:sSub>
+            <m:e>
+              <m:r>
+                <m:rPr>
+                  <m:sty m:val="p"/>
+                </m:rPr>
+                <m:t>P</m:t>
+              </m:r>
+            </m:e>
+            <m:sub>
+              <m:r>
+                <m:rPr>
+                  <m:sty m:val="p"/>
+                </m:rPr>
+                <m:t>0</m:t>
+              </m:r>
+            </m:sub>
+          </m:sSub>
+          <m:r>
+            <m:rPr>
+              <m:sty m:val="p"/>
+            </m:rPr>
+            <m:t> − 10n · </m:t>
+          </m:r>
+          <m:sSub>
+            <m:e>
+              <m:r>
+                <m:rPr>
+                  <m:sty m:val="p"/>
+                </m:rPr>
+                <m:t>log</m:t>
+              </m:r>
+            </m:e>
+            <m:sub>
+              <m:r>
+                <m:rPr>
+                  <m:sty m:val="p"/>
+                </m:rPr>
+                <m:t>10</m:t>
+              </m:r>
+            </m:sub>
+          </m:sSub>
+          <m:d>
+            <m:dPr>
+              <m:begChr m:val="("/>
+              <m:endChr m:val=")"/>
+            </m:dPr>
+            <m:e>
+              <m:f>
+                <m:num>
+                  <m:r>
+                    <m:rPr>
+                      <m:sty m:val="p"/>
+                    </m:rPr>
+                    <m:t>d</m:t>
+                  </m:r>
+                </m:num>
+                <m:den>
+                  <m:sSub>
+                    <m:e>
+                      <m:r>
+                        <m:rPr>
+                          <m:sty m:val="p"/>
+                        </m:rPr>
+                        <m:t>d</m:t>
+                      </m:r>
+                    </m:e>
+                    <m:sub>
+                      <m:r>
+                        <m:rPr>
+                          <m:sty m:val="p"/>
+                        </m:rPr>
+                        <m:t>0</m:t>
+                      </m:r>
+                    </m:sub>
+                  </m:sSub>
+                </m:den>
+              </m:f>
+            </m:e>
+          </m:d>
+          <m:r>
+            <m:rPr>
+              <m:sty m:val="p"/>
+            </m:rPr>
+            <m:t> + </m:t>
+          </m:r>
+          <m:sSub>
+            <m:e>
+              <m:r>
+                <m:rPr>
+                  <m:sty m:val="p"/>
+                </m:rPr>
+                <m:t>X</m:t>
+              </m:r>
+            </m:e>
+            <m:sub>
+              <m:r>
+                <m:rPr>
+                  <m:sty m:val="p"/>
+                </m:rPr>
+                <m:t>σ</m:t>
+              </m:r>
+            </m:sub>
+          </m:sSub>
+        </m:oMath>
+      </m:oMathPara>
     </w:p>
     <w:p xmlns:m="http://schemas.openxmlformats.org/officeDocument/2006/math">
       <w:pPr>
@@ -4908,6 +5576,129 @@
       <w:r>
         <w:t>) để ước lượng khoảng cách:</w:t>
       </w:r>
+    </w:p>
+    <w:p>
+      <w:pPr>
+        <w:ind w:firstLine="0"/>
+        <w:jc w:val="center"/>
+      </w:pPr>
+      <m:oMathPara xmlns:m="http://schemas.openxmlformats.org/officeDocument/2006/math">
+        <m:oMath>
+          <m:acc>
+            <m:accPr>
+              <m:chr m:val="̂"/>
+            </m:accPr>
+            <m:e>
+              <m:r>
+                <m:rPr>
+                  <m:sty m:val="p"/>
+                </m:rPr>
+                <m:t>d</m:t>
+              </m:r>
+            </m:e>
+          </m:acc>
+          <m:r>
+            <m:rPr>
+              <m:sty m:val="p"/>
+            </m:rPr>
+            <m:t> = </m:t>
+          </m:r>
+          <m:sSub>
+            <m:e>
+              <m:r>
+                <m:rPr>
+                  <m:sty m:val="p"/>
+                </m:rPr>
+                <m:t>d</m:t>
+              </m:r>
+            </m:e>
+            <m:sub>
+              <m:r>
+                <m:rPr>
+                  <m:sty m:val="p"/>
+                </m:rPr>
+                <m:t>0</m:t>
+              </m:r>
+            </m:sub>
+          </m:sSub>
+          <m:r>
+            <m:rPr>
+              <m:sty m:val="p"/>
+            </m:rPr>
+            <m:t> · </m:t>
+          </m:r>
+          <m:sSup>
+            <m:e>
+              <m:r>
+                <m:rPr>
+                  <m:sty m:val="p"/>
+                </m:rPr>
+                <m:t>10</m:t>
+              </m:r>
+            </m:e>
+            <m:sup>
+              <m:f>
+                <m:num>
+                  <m:box>
+                    <m:e>
+                      <m:sSub>
+                        <m:e>
+                          <m:r>
+                            <m:rPr>
+                              <m:sty m:val="p"/>
+                            </m:rPr>
+                            <m:t>P</m:t>
+                          </m:r>
+                        </m:e>
+                        <m:sub>
+                          <m:r>
+                            <m:rPr>
+                              <m:sty m:val="p"/>
+                            </m:rPr>
+                            <m:t>0</m:t>
+                          </m:r>
+                        </m:sub>
+                      </m:sSub>
+                      <m:r>
+                        <m:rPr>
+                          <m:sty m:val="p"/>
+                        </m:rPr>
+                        <m:t> − </m:t>
+                      </m:r>
+                      <m:sSub>
+                        <m:e>
+                          <m:r>
+                            <m:rPr>
+                              <m:sty m:val="p"/>
+                            </m:rPr>
+                            <m:t>P</m:t>
+                          </m:r>
+                        </m:e>
+                        <m:sub>
+                          <m:r>
+                            <m:rPr>
+                              <m:sty m:val="p"/>
+                            </m:rPr>
+                            <m:t>r</m:t>
+                          </m:r>
+                        </m:sub>
+                      </m:sSub>
+                    </m:e>
+                  </m:box>
+                </m:num>
+                <m:den>
+                  <m:r>
+                    <m:rPr>
+                      <m:sty m:val="p"/>
+                    </m:rPr>
+                    <m:t>10n</m:t>
+                  </m:r>
+                </m:den>
+              </m:f>
+            </m:sup>
+          </m:sSup>
+        </m:oMath>
+      </m:oMathPara>
     </w:p>
     <w:p xmlns:m="http://schemas.openxmlformats.org/officeDocument/2006/math">
       <w:pPr>
@@ -5959,6 +6750,380 @@
         <w:t>. Cập nhật:</w:t>
       </w:r>
     </w:p>
+    <w:p>
+      <w:pPr>
+        <w:ind w:firstLine="0"/>
+        <w:jc w:val="center"/>
+      </w:pPr>
+      <m:oMathPara xmlns:m="http://schemas.openxmlformats.org/officeDocument/2006/math">
+        <m:oMath>
+          <m:sSub>
+            <m:e>
+              <m:r>
+                <m:rPr>
+                  <m:sty m:val="p"/>
+                </m:rPr>
+                <m:t>p</m:t>
+              </m:r>
+            </m:e>
+            <m:sub>
+              <m:r>
+                <m:rPr>
+                  <m:sty m:val="p"/>
+                </m:rPr>
+                <m:t>k</m:t>
+              </m:r>
+            </m:sub>
+          </m:sSub>
+          <m:r>
+            <m:rPr>
+              <m:sty m:val="p"/>
+            </m:rPr>
+            <m:t> = </m:t>
+          </m:r>
+          <m:sSub>
+            <m:e>
+              <m:r>
+                <m:rPr>
+                  <m:sty m:val="p"/>
+                </m:rPr>
+                <m:t>p</m:t>
+              </m:r>
+            </m:e>
+            <m:sub>
+              <m:r>
+                <m:rPr>
+                  <m:sty m:val="p"/>
+                </m:rPr>
+                <m:t>k−1</m:t>
+              </m:r>
+            </m:sub>
+          </m:sSub>
+          <m:r>
+            <m:rPr>
+              <m:sty m:val="p"/>
+            </m:rPr>
+            <m:t> + q</m:t>
+          </m:r>
+        </m:oMath>
+      </m:oMathPara>
+    </w:p>
+    <w:p>
+      <w:pPr>
+        <w:ind w:firstLine="0"/>
+        <w:jc w:val="center"/>
+      </w:pPr>
+      <m:oMathPara xmlns:m="http://schemas.openxmlformats.org/officeDocument/2006/math">
+        <m:oMath>
+          <m:sSub>
+            <m:e>
+              <m:r>
+                <m:rPr>
+                  <m:sty m:val="p"/>
+                </m:rPr>
+                <m:t>K</m:t>
+              </m:r>
+            </m:e>
+            <m:sub>
+              <m:r>
+                <m:rPr>
+                  <m:sty m:val="p"/>
+                </m:rPr>
+                <m:t>k</m:t>
+              </m:r>
+            </m:sub>
+          </m:sSub>
+          <m:r>
+            <m:rPr>
+              <m:sty m:val="p"/>
+            </m:rPr>
+            <m:t> = </m:t>
+          </m:r>
+          <m:f>
+            <m:num>
+              <m:sSub>
+                <m:e>
+                  <m:r>
+                    <m:rPr>
+                      <m:sty m:val="p"/>
+                    </m:rPr>
+                    <m:t>p</m:t>
+                  </m:r>
+                </m:e>
+                <m:sub>
+                  <m:r>
+                    <m:rPr>
+                      <m:sty m:val="p"/>
+                    </m:rPr>
+                    <m:t>k</m:t>
+                  </m:r>
+                </m:sub>
+              </m:sSub>
+            </m:num>
+            <m:den>
+              <m:box>
+                <m:e>
+                  <m:sSub>
+                    <m:e>
+                      <m:r>
+                        <m:rPr>
+                          <m:sty m:val="p"/>
+                        </m:rPr>
+                        <m:t>p</m:t>
+                      </m:r>
+                    </m:e>
+                    <m:sub>
+                      <m:r>
+                        <m:rPr>
+                          <m:sty m:val="p"/>
+                        </m:rPr>
+                        <m:t>k</m:t>
+                      </m:r>
+                    </m:sub>
+                  </m:sSub>
+                  <m:r>
+                    <m:rPr>
+                      <m:sty m:val="p"/>
+                    </m:rPr>
+                    <m:t> + r</m:t>
+                  </m:r>
+                </m:e>
+              </m:box>
+            </m:den>
+          </m:f>
+        </m:oMath>
+      </m:oMathPara>
+    </w:p>
+    <w:p>
+      <w:pPr>
+        <w:ind w:firstLine="0"/>
+        <w:jc w:val="center"/>
+      </w:pPr>
+      <m:oMathPara xmlns:m="http://schemas.openxmlformats.org/officeDocument/2006/math">
+        <m:oMath>
+          <m:sSub>
+            <m:e>
+              <m:r>
+                <m:rPr>
+                  <m:sty m:val="p"/>
+                </m:rPr>
+                <m:t>x</m:t>
+              </m:r>
+            </m:e>
+            <m:sub>
+              <m:r>
+                <m:rPr>
+                  <m:sty m:val="p"/>
+                </m:rPr>
+                <m:t>k</m:t>
+              </m:r>
+            </m:sub>
+          </m:sSub>
+          <m:r>
+            <m:rPr>
+              <m:sty m:val="p"/>
+            </m:rPr>
+            <m:t> = </m:t>
+          </m:r>
+          <m:sSub>
+            <m:e>
+              <m:r>
+                <m:rPr>
+                  <m:sty m:val="p"/>
+                </m:rPr>
+                <m:t>x</m:t>
+              </m:r>
+            </m:e>
+            <m:sub>
+              <m:r>
+                <m:rPr>
+                  <m:sty m:val="p"/>
+                </m:rPr>
+                <m:t>k−1</m:t>
+              </m:r>
+            </m:sub>
+          </m:sSub>
+          <m:r>
+            <m:rPr>
+              <m:sty m:val="p"/>
+            </m:rPr>
+            <m:t> + </m:t>
+          </m:r>
+          <m:sSub>
+            <m:e>
+              <m:r>
+                <m:rPr>
+                  <m:sty m:val="p"/>
+                </m:rPr>
+                <m:t>K</m:t>
+              </m:r>
+            </m:e>
+            <m:sub>
+              <m:r>
+                <m:rPr>
+                  <m:sty m:val="p"/>
+                </m:rPr>
+                <m:t>k</m:t>
+              </m:r>
+            </m:sub>
+          </m:sSub>
+          <m:r>
+            <m:rPr>
+              <m:sty m:val="p"/>
+            </m:rPr>
+            <m:t> · </m:t>
+          </m:r>
+          <m:d>
+            <m:dPr>
+              <m:begChr m:val="("/>
+              <m:endChr m:val=")"/>
+            </m:dPr>
+            <m:e>
+              <m:box>
+                <m:e>
+                  <m:sSub>
+                    <m:e>
+                      <m:r>
+                        <m:rPr>
+                          <m:sty m:val="p"/>
+                        </m:rPr>
+                        <m:t>z</m:t>
+                      </m:r>
+                    </m:e>
+                    <m:sub>
+                      <m:r>
+                        <m:rPr>
+                          <m:sty m:val="p"/>
+                        </m:rPr>
+                        <m:t>k</m:t>
+                      </m:r>
+                    </m:sub>
+                  </m:sSub>
+                  <m:r>
+                    <m:rPr>
+                      <m:sty m:val="p"/>
+                    </m:rPr>
+                    <m:t> − </m:t>
+                  </m:r>
+                  <m:sSub>
+                    <m:e>
+                      <m:r>
+                        <m:rPr>
+                          <m:sty m:val="p"/>
+                        </m:rPr>
+                        <m:t>x</m:t>
+                      </m:r>
+                    </m:e>
+                    <m:sub>
+                      <m:r>
+                        <m:rPr>
+                          <m:sty m:val="p"/>
+                        </m:rPr>
+                        <m:t>k−1</m:t>
+                      </m:r>
+                    </m:sub>
+                  </m:sSub>
+                </m:e>
+              </m:box>
+            </m:e>
+          </m:d>
+        </m:oMath>
+      </m:oMathPara>
+    </w:p>
+    <w:p>
+      <w:pPr>
+        <w:ind w:firstLine="0"/>
+        <w:jc w:val="center"/>
+      </w:pPr>
+      <m:oMathPara xmlns:m="http://schemas.openxmlformats.org/officeDocument/2006/math">
+        <m:oMath>
+          <m:sSub>
+            <m:e>
+              <m:r>
+                <m:rPr>
+                  <m:sty m:val="p"/>
+                </m:rPr>
+                <m:t>p</m:t>
+              </m:r>
+            </m:e>
+            <m:sub>
+              <m:r>
+                <m:rPr>
+                  <m:sty m:val="p"/>
+                </m:rPr>
+                <m:t>k</m:t>
+              </m:r>
+            </m:sub>
+          </m:sSub>
+          <m:r>
+            <m:rPr>
+              <m:sty m:val="p"/>
+            </m:rPr>
+            <m:t> = </m:t>
+          </m:r>
+          <m:d>
+            <m:dPr>
+              <m:begChr m:val="("/>
+              <m:endChr m:val=")"/>
+            </m:dPr>
+            <m:e>
+              <m:box>
+                <m:e>
+                  <m:r>
+                    <m:rPr>
+                      <m:sty m:val="p"/>
+                    </m:rPr>
+                    <m:t>1 − </m:t>
+                  </m:r>
+                  <m:sSub>
+                    <m:e>
+                      <m:r>
+                        <m:rPr>
+                          <m:sty m:val="p"/>
+                        </m:rPr>
+                        <m:t>K</m:t>
+                      </m:r>
+                    </m:e>
+                    <m:sub>
+                      <m:r>
+                        <m:rPr>
+                          <m:sty m:val="p"/>
+                        </m:rPr>
+                        <m:t>k</m:t>
+                      </m:r>
+                    </m:sub>
+                  </m:sSub>
+                </m:e>
+              </m:box>
+            </m:e>
+          </m:d>
+          <m:r>
+            <m:rPr>
+              <m:sty m:val="p"/>
+            </m:rPr>
+            <m:t> · </m:t>
+          </m:r>
+          <m:sSub>
+            <m:e>
+              <m:r>
+                <m:rPr>
+                  <m:sty m:val="p"/>
+                </m:rPr>
+                <m:t>p</m:t>
+              </m:r>
+            </m:e>
+            <m:sub>
+              <m:r>
+                <m:rPr>
+                  <m:sty m:val="p"/>
+                </m:rPr>
+                <m:t>k</m:t>
+              </m:r>
+            </m:sub>
+          </m:sSub>
+        </m:oMath>
+      </m:oMathPara>
+    </w:p>
     <w:p xmlns:m="http://schemas.openxmlformats.org/officeDocument/2006/math">
       <w:pPr>
         <w:jc w:val="center"/>
@@ -7843,6 +9008,94 @@
       <w:r>
         <w:t xml:space="preserve"> tạo mã xác thực từ dữ liệu và khoá bí mật:</w:t>
       </w:r>
+    </w:p>
+    <w:p>
+      <w:pPr>
+        <w:ind w:firstLine="0"/>
+        <w:jc w:val="center"/>
+      </w:pPr>
+      <m:oMathPara xmlns:m="http://schemas.openxmlformats.org/officeDocument/2006/math">
+        <m:oMath>
+          <m:r>
+            <m:rPr>
+              <m:sty m:val="p"/>
+            </m:rPr>
+            <m:t>HMAC(K, m) = H</m:t>
+          </m:r>
+          <m:d>
+            <m:dPr>
+              <m:begChr m:val="("/>
+              <m:endChr m:val=")"/>
+            </m:dPr>
+            <m:e>
+              <m:box>
+                <m:e>
+                  <m:d>
+                    <m:dPr>
+                      <m:begChr m:val="("/>
+                      <m:endChr m:val=")"/>
+                    </m:dPr>
+                    <m:e>
+                      <m:box>
+                        <m:e>
+                          <m:r>
+                            <m:rPr>
+                              <m:sty m:val="p"/>
+                            </m:rPr>
+                            <m:t>K′ ⊕ opad</m:t>
+                          </m:r>
+                        </m:e>
+                      </m:box>
+                    </m:e>
+                  </m:d>
+                  <m:r>
+                    <m:rPr>
+                      <m:sty m:val="p"/>
+                    </m:rPr>
+                    <m:t> ∥ H</m:t>
+                  </m:r>
+                  <m:d>
+                    <m:dPr>
+                      <m:begChr m:val="("/>
+                      <m:endChr m:val=")"/>
+                    </m:dPr>
+                    <m:e>
+                      <m:box>
+                        <m:e>
+                          <m:d>
+                            <m:dPr>
+                              <m:begChr m:val="("/>
+                              <m:endChr m:val=")"/>
+                            </m:dPr>
+                            <m:e>
+                              <m:box>
+                                <m:e>
+                                  <m:r>
+                                    <m:rPr>
+                                      <m:sty m:val="p"/>
+                                    </m:rPr>
+                                    <m:t>K′ ⊕ ipad</m:t>
+                                  </m:r>
+                                </m:e>
+                              </m:box>
+                            </m:e>
+                          </m:d>
+                          <m:r>
+                            <m:rPr>
+                              <m:sty m:val="p"/>
+                            </m:rPr>
+                            <m:t> ∥ m</m:t>
+                          </m:r>
+                        </m:e>
+                      </m:box>
+                    </m:e>
+                  </m:d>
+                </m:e>
+              </m:box>
+            </m:e>
+          </m:d>
+        </m:oMath>
+      </m:oMathPara>
     </w:p>
     <w:p xmlns:m="http://schemas.openxmlformats.org/officeDocument/2006/math">
       <w:pPr>
@@ -8198,6 +9451,62 @@
         <w:t xml:space="preserve"> dẫn xuất:</w:t>
       </w:r>
     </w:p>
+    <w:p>
+      <w:pPr>
+        <w:ind w:firstLine="0"/>
+        <w:jc w:val="center"/>
+      </w:pPr>
+      <m:oMathPara xmlns:m="http://schemas.openxmlformats.org/officeDocument/2006/math">
+        <m:oMath>
+          <m:r>
+            <m:rPr>
+              <m:sty m:val="p"/>
+            </m:rPr>
+            <m:t>epoch_counter = ⌊</m:t>
+          </m:r>
+          <m:f>
+            <m:num>
+              <m:r>
+                <m:rPr>
+                  <m:sty m:val="p"/>
+                </m:rPr>
+                <m:t>esp_timer_get_time()</m:t>
+              </m:r>
+            </m:num>
+            <m:den>
+              <m:r>
+                <m:rPr>
+                  <m:sty m:val="p"/>
+                </m:rPr>
+                <m:t>1 giờ</m:t>
+              </m:r>
+            </m:den>
+          </m:f>
+          <m:r>
+            <m:rPr>
+              <m:sty m:val="p"/>
+            </m:rPr>
+            <m:t>⌋</m:t>
+          </m:r>
+        </m:oMath>
+      </m:oMathPara>
+    </w:p>
+    <w:p>
+      <w:pPr>
+        <w:ind w:firstLine="0"/>
+        <w:jc w:val="center"/>
+      </w:pPr>
+      <m:oMathPara xmlns:m="http://schemas.openxmlformats.org/officeDocument/2006/math">
+        <m:oMath>
+          <m:r>
+            <m:rPr>
+              <m:sty m:val="p"/>
+            </m:rPr>
+            <m:t>epoch_key = HKDF(master_key, epoch_counter)</m:t>
+          </m:r>
+        </m:oMath>
+      </m:oMathPara>
+    </w:p>
     <w:p xmlns:m="http://schemas.openxmlformats.org/officeDocument/2006/math">
       <w:pPr>
         <w:jc w:val="center"/>
@@ -13013,7 +14322,7 @@
         <w:pStyle w:val="Heading2"/>
       </w:pPr>
       <w:r>
-        <w:t>Bảo mật end-to-end</w:t>
+        <w:t>Bảo mật xuyên suốt</w:t>
       </w:r>
     </w:p>
     <w:p>
@@ -14585,7 +15894,7 @@
         <w:pStyle w:val="Heading2"/>
       </w:pPr>
       <w:r>
-        <w:t>Test 1: Bring-up hệ thống</w:t>
+        <w:t>Kiểm thử 1: Bring-up hệ thống</w:t>
       </w:r>
     </w:p>
     <w:p>
@@ -14901,7 +16210,7 @@
         <w:pStyle w:val="Heading2"/>
       </w:pPr>
       <w:r>
-        <w:t>Test 2: Độ chính xác định vị theo phòng</w:t>
+        <w:t>Kiểm thử 2: Độ chính xác định vị theo phòng</w:t>
       </w:r>
     </w:p>
     <w:p>
@@ -15208,7 +16517,7 @@
         <w:pStyle w:val="Heading2"/>
       </w:pPr>
       <w:r>
-        <w:t>Test 3: Chống flapping tại biên phòng (hysteresis)</w:t>
+        <w:t>Kiểm thử 3: Chống flapping tại biên phòng (hysteresis)</w:t>
       </w:r>
     </w:p>
     <w:p>
@@ -15430,7 +16739,7 @@
         <w:pStyle w:val="Heading2"/>
       </w:pPr>
       <w:r>
-        <w:t>Test 4: Tự phục hồi (self-healing)</w:t>
+        <w:t>Kiểm thử 4: Tự phục hồi</w:t>
       </w:r>
     </w:p>
     <w:p>
@@ -15549,7 +16858,7 @@
         <w:pStyle w:val="Heading2"/>
       </w:pPr>
       <w:r>
-        <w:t>Test 5: OTA</w:t>
+        <w:t>Kiểm thử 5: OTA</w:t>
       </w:r>
     </w:p>
     <w:p>
@@ -15996,7 +17305,7 @@
         <w:pStyle w:val="Heading2"/>
       </w:pPr>
       <w:r>
-        <w:t>Test 6: Bảo mật beacon</w:t>
+        <w:t>Kiểm thử 6: Bảo mật beacon</w:t>
       </w:r>
     </w:p>
     <w:p>
@@ -16267,7 +17576,7 @@
         <w:pStyle w:val="ListBullet"/>
       </w:pPr>
       <w:r>
-        <w:t>Chưa test scale trên 10 tag đồng thời hoặc &gt;5 scanner. BLE Mesh về lý thuyết chịu được vài trăm node nhưng độ trễ end-to-end sẽ tăng.</w:t>
+        <w:t>Chưa test scale trên 10 tag đồng thời hoặc &gt;5 scanner. BLE Mesh về lý thuyết chịu được vài trăm node nhưng độ trễ xuyên suốt sẽ tăng.</w:t>
       </w:r>
     </w:p>
     <w:p>
@@ -17146,13 +18455,7 @@
         <w:pStyle w:val="ListBullet"/>
       </w:pPr>
       <w:r>
-        <w:rPr>
-          <w:b/>
-        </w:rPr>
-        <w:t>Chưa test scale lớn</w:t>
-      </w:r>
-      <w:r>
-        <w:t>. Thí nghiệm dừng ở 3 tag và 3 scanner. BLE Mesh về lý thuyết chịu được vài trăm node nhưng độ trễ end-to-end sẽ tăng và cần đo lại.</w:t>
+        <w:t>Chưa test scale lớn. Thí nghiệm dừng ở 3 tag và 3 scanner. BLE Mesh về lý thuyết chịu được vài trăm node nhưng độ trễ xuyên suốt sẽ tăng và cần đo lại.</w:t>
       </w:r>
     </w:p>
     <w:p>

</xml_diff>